<commit_message>
initial responses count table
</commit_message>
<xml_diff>
--- a/inst/templates/styling/doc_template.docx
+++ b/inst/templates/styling/doc_template.docx
@@ -48,107 +48,40 @@
         <w:pStyle w:val="BodyText"/>
       </w:pPr>
     </w:p>
-    <w:tbl>
-      <w:tblPr>
-        <w:tblStyle w:val="TableGrid"/>
-        <w:tblW w:w="0" w:type="auto"/>
-        <w:tblLook w:val="04A0" w:firstRow="1" w:lastRow="0" w:firstColumn="1" w:lastColumn="0" w:noHBand="0" w:noVBand="1"/>
-      </w:tblPr>
-      <w:tblGrid>
-        <w:gridCol w:w="4984"/>
-        <w:gridCol w:w="4984"/>
-      </w:tblGrid>
-      <w:tr>
-        <w:trPr>
-          <w:cnfStyle w:val="100000000000" w:firstRow="1" w:lastRow="0" w:firstColumn="0" w:lastColumn="0" w:oddVBand="0" w:evenVBand="0" w:oddHBand="0" w:evenHBand="0" w:firstRowFirstColumn="0" w:firstRowLastColumn="0" w:lastRowFirstColumn="0" w:lastRowLastColumn="0"/>
-        </w:trPr>
-        <w:tc>
-          <w:tcPr>
-            <w:tcW w:w="4984" w:type="dxa"/>
-          </w:tcPr>
-          <w:bookmarkEnd w:id="0"/>
-          <w:p>
-            <w:r>
-              <w:t>Table</w:t>
-            </w:r>
-          </w:p>
-        </w:tc>
-        <w:tc>
-          <w:tcPr>
-            <w:tcW w:w="4984" w:type="dxa"/>
-          </w:tcPr>
-          <w:p>
-            <w:r>
-              <w:t>Test out</w:t>
-            </w:r>
-          </w:p>
-        </w:tc>
-      </w:tr>
-      <w:tr>
-        <w:trPr>
-          <w:cnfStyle w:val="000000100000" w:firstRow="0" w:lastRow="0" w:firstColumn="0" w:lastColumn="0" w:oddVBand="0" w:evenVBand="0" w:oddHBand="1" w:evenHBand="0" w:firstRowFirstColumn="0" w:firstRowLastColumn="0" w:lastRowFirstColumn="0" w:lastRowLastColumn="0"/>
-        </w:trPr>
-        <w:tc>
-          <w:tcPr>
-            <w:tcW w:w="4984" w:type="dxa"/>
-          </w:tcPr>
-          <w:p>
-            <w:r>
-              <w:t>A</w:t>
-            </w:r>
-          </w:p>
-        </w:tc>
-        <w:tc>
-          <w:tcPr>
-            <w:tcW w:w="4984" w:type="dxa"/>
-          </w:tcPr>
-          <w:p/>
-        </w:tc>
-      </w:tr>
-      <w:tr>
-        <w:trPr>
-          <w:cnfStyle w:val="000000010000" w:firstRow="0" w:lastRow="0" w:firstColumn="0" w:lastColumn="0" w:oddVBand="0" w:evenVBand="0" w:oddHBand="0" w:evenHBand="1" w:firstRowFirstColumn="0" w:firstRowLastColumn="0" w:lastRowFirstColumn="0" w:lastRowLastColumn="0"/>
-        </w:trPr>
-        <w:tc>
-          <w:tcPr>
-            <w:tcW w:w="4984" w:type="dxa"/>
-          </w:tcPr>
-          <w:p>
-            <w:r>
-              <w:t>B</w:t>
-            </w:r>
-          </w:p>
-        </w:tc>
-        <w:tc>
-          <w:tcPr>
-            <w:tcW w:w="4984" w:type="dxa"/>
-          </w:tcPr>
-          <w:p/>
-        </w:tc>
-      </w:tr>
-      <w:tr>
-        <w:trPr>
-          <w:cnfStyle w:val="000000100000" w:firstRow="0" w:lastRow="0" w:firstColumn="0" w:lastColumn="0" w:oddVBand="0" w:evenVBand="0" w:oddHBand="1" w:evenHBand="0" w:firstRowFirstColumn="0" w:firstRowLastColumn="0" w:lastRowFirstColumn="0" w:lastRowLastColumn="0"/>
-        </w:trPr>
-        <w:tc>
-          <w:tcPr>
-            <w:tcW w:w="4984" w:type="dxa"/>
-          </w:tcPr>
-          <w:p>
-            <w:r>
-              <w:t>C</w:t>
-            </w:r>
-          </w:p>
-        </w:tc>
-        <w:tc>
-          <w:tcPr>
-            <w:tcW w:w="4984" w:type="dxa"/>
-          </w:tcPr>
-          <w:p/>
-        </w:tc>
-      </w:tr>
-    </w:tbl>
+    <w:bookmarkEnd w:id="0"/>
     <w:p/>
+    <w:p>
+      <w:pPr>
+        <w:pStyle w:val="TableCaption"/>
+      </w:pPr>
+      <w:r>
+        <w:t xml:space="preserve">Table </w:t>
+      </w:r>
+      <w:r>
+        <w:fldChar w:fldCharType="begin"/>
+      </w:r>
+      <w:r>
+        <w:instrText xml:space="preserve"> SEQ Table \* ARABIC </w:instrText>
+      </w:r>
+      <w:r>
+        <w:fldChar w:fldCharType="separate"/>
+      </w:r>
+      <w:r>
+        <w:rPr>
+          <w:noProof/>
+        </w:rPr>
+        <w:t>1</w:t>
+      </w:r>
+      <w:r>
+        <w:fldChar w:fldCharType="end"/>
+      </w:r>
+      <w:r>
+        <w:t xml:space="preserve"> sample </w:t>
+      </w:r>
+      <w:r>
+        <w:t>caption</w:t>
+      </w:r>
+    </w:p>
     <w:tbl>
       <w:tblPr>
         <w:tblStyle w:val="Table"/>
@@ -297,9 +230,9 @@
     </w:tbl>
     <w:p/>
     <w:sectPr>
-      <w:footerReference w:type="default" r:id="rId7"/>
-      <w:headerReference w:type="first" r:id="rId8"/>
-      <w:footerReference w:type="first" r:id="rId9"/>
+      <w:footerReference w:type="default" r:id="rId8"/>
+      <w:headerReference w:type="first" r:id="rId9"/>
+      <w:footerReference w:type="first" r:id="rId10"/>
       <w:pgSz w:w="11906" w:h="16838" w:code="9"/>
       <w:pgMar w:top="1440" w:right="1077" w:bottom="1440" w:left="1077" w:header="3402" w:footer="1191" w:gutter="0"/>
       <w:cols w:space="720"/>
@@ -1815,11 +1748,12 @@
     <w:name w:val="caption"/>
     <w:basedOn w:val="Normal"/>
     <w:link w:val="CaptionChar"/>
+    <w:rsid w:val="003259EB"/>
     <w:pPr>
       <w:spacing w:after="120"/>
     </w:pPr>
     <w:rPr>
-      <w:i/>
+      <w:b/>
     </w:rPr>
   </w:style>
   <w:style w:type="paragraph" w:customStyle="1" w:styleId="TableCaption">
@@ -1848,6 +1782,12 @@
     <w:name w:val="Caption Char"/>
     <w:basedOn w:val="DefaultParagraphFont"/>
     <w:link w:val="Caption"/>
+    <w:rsid w:val="003259EB"/>
+    <w:rPr>
+      <w:rFonts w:ascii="Roboto" w:hAnsi="Roboto"/>
+      <w:b/>
+      <w:lang w:val="en-GB"/>
+    </w:rPr>
   </w:style>
   <w:style w:type="character" w:customStyle="1" w:styleId="VerbatimChar">
     <w:name w:val="Verbatim Char"/>
@@ -1855,25 +1795,38 @@
     <w:link w:val="SourceCode"/>
     <w:rPr>
       <w:rFonts w:ascii="Consolas" w:hAnsi="Consolas"/>
-      <w:sz w:val="22"/>
+      <w:b/>
+      <w:sz w:val="22"/>
+      <w:lang w:val="en-GB"/>
     </w:rPr>
   </w:style>
   <w:style w:type="character" w:customStyle="1" w:styleId="SectionNumber">
     <w:name w:val="Section Number"/>
     <w:basedOn w:val="CaptionChar"/>
+    <w:rPr>
+      <w:rFonts w:ascii="Roboto" w:hAnsi="Roboto"/>
+      <w:b/>
+      <w:lang w:val="en-GB"/>
+    </w:rPr>
   </w:style>
   <w:style w:type="character" w:styleId="FootnoteReference">
     <w:name w:val="footnote reference"/>
     <w:basedOn w:val="CaptionChar"/>
     <w:rPr>
+      <w:rFonts w:ascii="Roboto" w:hAnsi="Roboto"/>
+      <w:b/>
       <w:vertAlign w:val="superscript"/>
+      <w:lang w:val="en-GB"/>
     </w:rPr>
   </w:style>
   <w:style w:type="character" w:styleId="Hyperlink">
     <w:name w:val="Hyperlink"/>
     <w:basedOn w:val="CaptionChar"/>
     <w:rPr>
+      <w:rFonts w:ascii="Roboto" w:hAnsi="Roboto"/>
+      <w:b/>
       <w:color w:val="4F81BD" w:themeColor="accent1"/>
+      <w:lang w:val="en-GB"/>
     </w:rPr>
   </w:style>
   <w:style w:type="paragraph" w:styleId="TOCHeading">
@@ -1907,9 +1860,11 @@
     <w:basedOn w:val="VerbatimChar"/>
     <w:rPr>
       <w:rFonts w:ascii="Consolas" w:hAnsi="Consolas"/>
+      <w:b/>
       <w:color w:val="003B4F"/>
       <w:sz w:val="22"/>
       <w:shd w:val="clear" w:color="auto" w:fill="F1F3F5"/>
+      <w:lang w:val="en-GB"/>
     </w:rPr>
   </w:style>
   <w:style w:type="character" w:customStyle="1" w:styleId="DataTypeTok">
@@ -1917,9 +1872,11 @@
     <w:basedOn w:val="VerbatimChar"/>
     <w:rPr>
       <w:rFonts w:ascii="Consolas" w:hAnsi="Consolas"/>
+      <w:b/>
       <w:color w:val="AD0000"/>
       <w:sz w:val="22"/>
       <w:shd w:val="clear" w:color="auto" w:fill="F1F3F5"/>
+      <w:lang w:val="en-GB"/>
     </w:rPr>
   </w:style>
   <w:style w:type="character" w:customStyle="1" w:styleId="DecValTok">
@@ -1927,9 +1884,11 @@
     <w:basedOn w:val="VerbatimChar"/>
     <w:rPr>
       <w:rFonts w:ascii="Consolas" w:hAnsi="Consolas"/>
+      <w:b/>
       <w:color w:val="AD0000"/>
       <w:sz w:val="22"/>
       <w:shd w:val="clear" w:color="auto" w:fill="F1F3F5"/>
+      <w:lang w:val="en-GB"/>
     </w:rPr>
   </w:style>
   <w:style w:type="character" w:customStyle="1" w:styleId="BaseNTok">
@@ -1937,9 +1896,11 @@
     <w:basedOn w:val="VerbatimChar"/>
     <w:rPr>
       <w:rFonts w:ascii="Consolas" w:hAnsi="Consolas"/>
+      <w:b/>
       <w:color w:val="AD0000"/>
       <w:sz w:val="22"/>
       <w:shd w:val="clear" w:color="auto" w:fill="F1F3F5"/>
+      <w:lang w:val="en-GB"/>
     </w:rPr>
   </w:style>
   <w:style w:type="character" w:customStyle="1" w:styleId="FloatTok">
@@ -1947,9 +1908,11 @@
     <w:basedOn w:val="VerbatimChar"/>
     <w:rPr>
       <w:rFonts w:ascii="Consolas" w:hAnsi="Consolas"/>
+      <w:b/>
       <w:color w:val="AD0000"/>
       <w:sz w:val="22"/>
       <w:shd w:val="clear" w:color="auto" w:fill="F1F3F5"/>
+      <w:lang w:val="en-GB"/>
     </w:rPr>
   </w:style>
   <w:style w:type="character" w:customStyle="1" w:styleId="ConstantTok">
@@ -1957,9 +1920,11 @@
     <w:basedOn w:val="VerbatimChar"/>
     <w:rPr>
       <w:rFonts w:ascii="Consolas" w:hAnsi="Consolas"/>
+      <w:b/>
       <w:color w:val="8F5902"/>
       <w:sz w:val="22"/>
       <w:shd w:val="clear" w:color="auto" w:fill="F1F3F5"/>
+      <w:lang w:val="en-GB"/>
     </w:rPr>
   </w:style>
   <w:style w:type="character" w:customStyle="1" w:styleId="CharTok">
@@ -1967,9 +1932,11 @@
     <w:basedOn w:val="VerbatimChar"/>
     <w:rPr>
       <w:rFonts w:ascii="Consolas" w:hAnsi="Consolas"/>
+      <w:b/>
       <w:color w:val="20794D"/>
       <w:sz w:val="22"/>
       <w:shd w:val="clear" w:color="auto" w:fill="F1F3F5"/>
+      <w:lang w:val="en-GB"/>
     </w:rPr>
   </w:style>
   <w:style w:type="character" w:customStyle="1" w:styleId="SpecialCharTok">
@@ -1977,9 +1944,11 @@
     <w:basedOn w:val="VerbatimChar"/>
     <w:rPr>
       <w:rFonts w:ascii="Consolas" w:hAnsi="Consolas"/>
+      <w:b/>
       <w:color w:val="5E5E5E"/>
       <w:sz w:val="22"/>
       <w:shd w:val="clear" w:color="auto" w:fill="F1F3F5"/>
+      <w:lang w:val="en-GB"/>
     </w:rPr>
   </w:style>
   <w:style w:type="character" w:customStyle="1" w:styleId="StringTok">
@@ -1987,9 +1956,11 @@
     <w:basedOn w:val="VerbatimChar"/>
     <w:rPr>
       <w:rFonts w:ascii="Consolas" w:hAnsi="Consolas"/>
+      <w:b/>
       <w:color w:val="20794D"/>
       <w:sz w:val="22"/>
       <w:shd w:val="clear" w:color="auto" w:fill="F1F3F5"/>
+      <w:lang w:val="en-GB"/>
     </w:rPr>
   </w:style>
   <w:style w:type="character" w:customStyle="1" w:styleId="VerbatimStringTok">
@@ -1997,9 +1968,11 @@
     <w:basedOn w:val="VerbatimChar"/>
     <w:rPr>
       <w:rFonts w:ascii="Consolas" w:hAnsi="Consolas"/>
+      <w:b/>
       <w:color w:val="20794D"/>
       <w:sz w:val="22"/>
       <w:shd w:val="clear" w:color="auto" w:fill="F1F3F5"/>
+      <w:lang w:val="en-GB"/>
     </w:rPr>
   </w:style>
   <w:style w:type="character" w:customStyle="1" w:styleId="SpecialStringTok">
@@ -2007,9 +1980,11 @@
     <w:basedOn w:val="VerbatimChar"/>
     <w:rPr>
       <w:rFonts w:ascii="Consolas" w:hAnsi="Consolas"/>
+      <w:b/>
       <w:color w:val="20794D"/>
       <w:sz w:val="22"/>
       <w:shd w:val="clear" w:color="auto" w:fill="F1F3F5"/>
+      <w:lang w:val="en-GB"/>
     </w:rPr>
   </w:style>
   <w:style w:type="character" w:customStyle="1" w:styleId="ImportTok">
@@ -2017,9 +1992,11 @@
     <w:basedOn w:val="VerbatimChar"/>
     <w:rPr>
       <w:rFonts w:ascii="Consolas" w:hAnsi="Consolas"/>
+      <w:b/>
       <w:color w:val="00769E"/>
       <w:sz w:val="22"/>
       <w:shd w:val="clear" w:color="auto" w:fill="F1F3F5"/>
+      <w:lang w:val="en-GB"/>
     </w:rPr>
   </w:style>
   <w:style w:type="character" w:customStyle="1" w:styleId="CommentTok">
@@ -2027,9 +2004,11 @@
     <w:basedOn w:val="VerbatimChar"/>
     <w:rPr>
       <w:rFonts w:ascii="Consolas" w:hAnsi="Consolas"/>
+      <w:b/>
       <w:color w:val="5E5E5E"/>
       <w:sz w:val="22"/>
       <w:shd w:val="clear" w:color="auto" w:fill="F1F3F5"/>
+      <w:lang w:val="en-GB"/>
     </w:rPr>
   </w:style>
   <w:style w:type="character" w:customStyle="1" w:styleId="DocumentationTok">
@@ -2037,10 +2016,12 @@
     <w:basedOn w:val="VerbatimChar"/>
     <w:rPr>
       <w:rFonts w:ascii="Consolas" w:hAnsi="Consolas"/>
+      <w:b/>
       <w:i/>
       <w:color w:val="5E5E5E"/>
       <w:sz w:val="22"/>
       <w:shd w:val="clear" w:color="auto" w:fill="F1F3F5"/>
+      <w:lang w:val="en-GB"/>
     </w:rPr>
   </w:style>
   <w:style w:type="character" w:customStyle="1" w:styleId="AnnotationTok">
@@ -2048,9 +2029,11 @@
     <w:basedOn w:val="VerbatimChar"/>
     <w:rPr>
       <w:rFonts w:ascii="Consolas" w:hAnsi="Consolas"/>
+      <w:b/>
       <w:color w:val="5E5E5E"/>
       <w:sz w:val="22"/>
       <w:shd w:val="clear" w:color="auto" w:fill="F1F3F5"/>
+      <w:lang w:val="en-GB"/>
     </w:rPr>
   </w:style>
   <w:style w:type="character" w:customStyle="1" w:styleId="CommentVarTok">
@@ -2058,10 +2041,12 @@
     <w:basedOn w:val="VerbatimChar"/>
     <w:rPr>
       <w:rFonts w:ascii="Consolas" w:hAnsi="Consolas"/>
+      <w:b/>
       <w:i/>
       <w:color w:val="5E5E5E"/>
       <w:sz w:val="22"/>
       <w:shd w:val="clear" w:color="auto" w:fill="F1F3F5"/>
+      <w:lang w:val="en-GB"/>
     </w:rPr>
   </w:style>
   <w:style w:type="character" w:customStyle="1" w:styleId="OtherTok">
@@ -2069,9 +2054,11 @@
     <w:basedOn w:val="VerbatimChar"/>
     <w:rPr>
       <w:rFonts w:ascii="Consolas" w:hAnsi="Consolas"/>
+      <w:b/>
       <w:color w:val="003B4F"/>
       <w:sz w:val="22"/>
       <w:shd w:val="clear" w:color="auto" w:fill="F1F3F5"/>
+      <w:lang w:val="en-GB"/>
     </w:rPr>
   </w:style>
   <w:style w:type="character" w:customStyle="1" w:styleId="FunctionTok">
@@ -2079,9 +2066,11 @@
     <w:basedOn w:val="VerbatimChar"/>
     <w:rPr>
       <w:rFonts w:ascii="Consolas" w:hAnsi="Consolas"/>
+      <w:b/>
       <w:color w:val="4758AB"/>
       <w:sz w:val="22"/>
       <w:shd w:val="clear" w:color="auto" w:fill="F1F3F5"/>
+      <w:lang w:val="en-GB"/>
     </w:rPr>
   </w:style>
   <w:style w:type="character" w:customStyle="1" w:styleId="VariableTok">
@@ -2089,9 +2078,11 @@
     <w:basedOn w:val="VerbatimChar"/>
     <w:rPr>
       <w:rFonts w:ascii="Consolas" w:hAnsi="Consolas"/>
+      <w:b/>
       <w:color w:val="111111"/>
       <w:sz w:val="22"/>
       <w:shd w:val="clear" w:color="auto" w:fill="F1F3F5"/>
+      <w:lang w:val="en-GB"/>
     </w:rPr>
   </w:style>
   <w:style w:type="character" w:customStyle="1" w:styleId="ControlFlowTok">
@@ -2099,9 +2090,11 @@
     <w:basedOn w:val="VerbatimChar"/>
     <w:rPr>
       <w:rFonts w:ascii="Consolas" w:hAnsi="Consolas"/>
+      <w:b/>
       <w:color w:val="003B4F"/>
       <w:sz w:val="22"/>
       <w:shd w:val="clear" w:color="auto" w:fill="F1F3F5"/>
+      <w:lang w:val="en-GB"/>
     </w:rPr>
   </w:style>
   <w:style w:type="character" w:customStyle="1" w:styleId="OperatorTok">
@@ -2109,9 +2102,11 @@
     <w:basedOn w:val="VerbatimChar"/>
     <w:rPr>
       <w:rFonts w:ascii="Consolas" w:hAnsi="Consolas"/>
+      <w:b/>
       <w:color w:val="5E5E5E"/>
       <w:sz w:val="22"/>
       <w:shd w:val="clear" w:color="auto" w:fill="F1F3F5"/>
+      <w:lang w:val="en-GB"/>
     </w:rPr>
   </w:style>
   <w:style w:type="character" w:customStyle="1" w:styleId="BuiltInTok">
@@ -2119,9 +2114,11 @@
     <w:basedOn w:val="VerbatimChar"/>
     <w:rPr>
       <w:rFonts w:ascii="Consolas" w:hAnsi="Consolas"/>
+      <w:b/>
       <w:color w:val="003B4F"/>
       <w:sz w:val="22"/>
       <w:shd w:val="clear" w:color="auto" w:fill="F1F3F5"/>
+      <w:lang w:val="en-GB"/>
     </w:rPr>
   </w:style>
   <w:style w:type="character" w:customStyle="1" w:styleId="ExtensionTok">
@@ -2129,9 +2126,11 @@
     <w:basedOn w:val="VerbatimChar"/>
     <w:rPr>
       <w:rFonts w:ascii="Consolas" w:hAnsi="Consolas"/>
+      <w:b/>
       <w:color w:val="003B4F"/>
       <w:sz w:val="22"/>
       <w:shd w:val="clear" w:color="auto" w:fill="F1F3F5"/>
+      <w:lang w:val="en-GB"/>
     </w:rPr>
   </w:style>
   <w:style w:type="character" w:customStyle="1" w:styleId="PreprocessorTok">
@@ -2139,9 +2138,11 @@
     <w:basedOn w:val="VerbatimChar"/>
     <w:rPr>
       <w:rFonts w:ascii="Consolas" w:hAnsi="Consolas"/>
+      <w:b/>
       <w:color w:val="AD0000"/>
       <w:sz w:val="22"/>
       <w:shd w:val="clear" w:color="auto" w:fill="F1F3F5"/>
+      <w:lang w:val="en-GB"/>
     </w:rPr>
   </w:style>
   <w:style w:type="character" w:customStyle="1" w:styleId="AttributeTok">
@@ -2149,9 +2150,11 @@
     <w:basedOn w:val="VerbatimChar"/>
     <w:rPr>
       <w:rFonts w:ascii="Consolas" w:hAnsi="Consolas"/>
+      <w:b/>
       <w:color w:val="657422"/>
       <w:sz w:val="22"/>
       <w:shd w:val="clear" w:color="auto" w:fill="F1F3F5"/>
+      <w:lang w:val="en-GB"/>
     </w:rPr>
   </w:style>
   <w:style w:type="character" w:customStyle="1" w:styleId="RegionMarkerTok">
@@ -2159,9 +2162,11 @@
     <w:basedOn w:val="VerbatimChar"/>
     <w:rPr>
       <w:rFonts w:ascii="Consolas" w:hAnsi="Consolas"/>
+      <w:b/>
       <w:color w:val="003B4F"/>
       <w:sz w:val="22"/>
       <w:shd w:val="clear" w:color="auto" w:fill="F1F3F5"/>
+      <w:lang w:val="en-GB"/>
     </w:rPr>
   </w:style>
   <w:style w:type="character" w:customStyle="1" w:styleId="InformationTok">
@@ -2169,9 +2174,11 @@
     <w:basedOn w:val="VerbatimChar"/>
     <w:rPr>
       <w:rFonts w:ascii="Consolas" w:hAnsi="Consolas"/>
+      <w:b/>
       <w:color w:val="5E5E5E"/>
       <w:sz w:val="22"/>
       <w:shd w:val="clear" w:color="auto" w:fill="F1F3F5"/>
+      <w:lang w:val="en-GB"/>
     </w:rPr>
   </w:style>
   <w:style w:type="character" w:customStyle="1" w:styleId="WarningTok">
@@ -2179,10 +2186,12 @@
     <w:basedOn w:val="VerbatimChar"/>
     <w:rPr>
       <w:rFonts w:ascii="Consolas" w:hAnsi="Consolas"/>
+      <w:b/>
       <w:i/>
       <w:color w:val="5E5E5E"/>
       <w:sz w:val="22"/>
       <w:shd w:val="clear" w:color="auto" w:fill="F1F3F5"/>
+      <w:lang w:val="en-GB"/>
     </w:rPr>
   </w:style>
   <w:style w:type="character" w:customStyle="1" w:styleId="AlertTok">
@@ -2190,9 +2199,11 @@
     <w:basedOn w:val="VerbatimChar"/>
     <w:rPr>
       <w:rFonts w:ascii="Consolas" w:hAnsi="Consolas"/>
+      <w:b/>
       <w:color w:val="AD0000"/>
       <w:sz w:val="22"/>
       <w:shd w:val="clear" w:color="auto" w:fill="F1F3F5"/>
+      <w:lang w:val="en-GB"/>
     </w:rPr>
   </w:style>
   <w:style w:type="character" w:customStyle="1" w:styleId="ErrorTok">
@@ -2200,9 +2211,11 @@
     <w:basedOn w:val="VerbatimChar"/>
     <w:rPr>
       <w:rFonts w:ascii="Consolas" w:hAnsi="Consolas"/>
+      <w:b/>
       <w:color w:val="AD0000"/>
       <w:sz w:val="22"/>
       <w:shd w:val="clear" w:color="auto" w:fill="F1F3F5"/>
+      <w:lang w:val="en-GB"/>
     </w:rPr>
   </w:style>
   <w:style w:type="character" w:customStyle="1" w:styleId="NormalTok">
@@ -2210,9 +2223,11 @@
     <w:basedOn w:val="VerbatimChar"/>
     <w:rPr>
       <w:rFonts w:ascii="Consolas" w:hAnsi="Consolas"/>
+      <w:b/>
       <w:color w:val="003B4F"/>
       <w:sz w:val="22"/>
       <w:shd w:val="clear" w:color="auto" w:fill="F1F3F5"/>
+      <w:lang w:val="en-GB"/>
     </w:rPr>
   </w:style>
   <w:style w:type="paragraph" w:customStyle="1" w:styleId="fpfooter">
@@ -2630,4 +2645,16 @@
   </a:objectDefaults>
   <a:extraClrSchemeLst/>
 </a:theme>
+</file>
+
+<file path=customXml/item1.xml><?xml version="1.0" encoding="utf-8"?>
+<b:Sources xmlns:b="http://schemas.openxmlformats.org/officeDocument/2006/bibliography" xmlns="http://schemas.openxmlformats.org/officeDocument/2006/bibliography" SelectedStyle="\APASixthEditionOfficeOnline.xsl" StyleName="APA" Version="6"/>
+</file>
+
+<file path=customXml/itemProps1.xml><?xml version="1.0" encoding="utf-8"?>
+<ds:datastoreItem xmlns:ds="http://schemas.openxmlformats.org/officeDocument/2006/customXml" ds:itemID="{F214D183-727D-4B3D-BEFC-9D7CD5DDD5DA}">
+  <ds:schemaRefs>
+    <ds:schemaRef ds:uri="http://schemas.openxmlformats.org/officeDocument/2006/bibliography"/>
+  </ds:schemaRefs>
+</ds:datastoreItem>
 </file>
</xml_diff>

<commit_message>
removed elements from TOC
</commit_message>
<xml_diff>
--- a/inst/templates/styling/doc_template.docx
+++ b/inst/templates/styling/doc_template.docx
@@ -22,7 +22,7 @@
     </w:p>
     <w:p>
       <w:pPr>
-        <w:pStyle w:val="Heading1"/>
+        <w:pStyle w:val="HeadingnoTOC"/>
       </w:pPr>
       <w:bookmarkStart w:id="0" w:name="acknowledgements"/>
       <w:r>
@@ -31,9 +31,6 @@
       </w:r>
     </w:p>
     <w:p>
-      <w:pPr>
-        <w:pStyle w:val="FirstParagraph"/>
-      </w:pPr>
       <w:r>
         <w:t>We wish to thank the Health Behaviour in School-aged Children (HBSC) Survey team and all Scottish schools and pupils who took part in the 2022 HBSC Survey. The HBSC Scotland study is funded by Public Health Scotland. Thank you to the Children's Society for allowing us to use the Good Childhood Index. We also thank colleagues based at the Public Health Research Facility at the MRC/CSO Social and Public Health Sciences Unit (University of Glasgow) for their work on developing the online survey and reporting portal. The SHINE project was originally funded by the MRC Mental Health Data Pathfinder (2018-2021) and is now funded by Medical Research Council core funding to Social and Public Health Sciences Unit at the University of Glasgow with contributions from some individual local authorities.</w:t>
       </w:r>
@@ -1316,9 +1313,13 @@
   <w:style w:type="paragraph" w:default="1" w:styleId="Normal">
     <w:name w:val="Normal"/>
     <w:qFormat/>
-    <w:rsid w:val="00F635E9"/>
+    <w:rsid w:val="00E34354"/>
+    <w:pPr>
+      <w:spacing w:line="336" w:lineRule="auto"/>
+    </w:pPr>
     <w:rPr>
       <w:rFonts w:ascii="Roboto" w:hAnsi="Roboto"/>
+      <w:sz w:val="22"/>
       <w:lang w:val="en-GB"/>
     </w:rPr>
   </w:style>
@@ -1326,6 +1327,7 @@
     <w:name w:val="heading 1"/>
     <w:basedOn w:val="Normal"/>
     <w:next w:val="BodyText"/>
+    <w:link w:val="Heading1Char"/>
     <w:uiPriority w:val="9"/>
     <w:qFormat/>
     <w:rsid w:val="00F635E9"/>
@@ -1533,9 +1535,6 @@
     <w:pPr>
       <w:spacing w:before="180" w:after="180" w:line="288" w:lineRule="auto"/>
     </w:pPr>
-    <w:rPr>
-      <w:sz w:val="22"/>
-    </w:rPr>
   </w:style>
   <w:style w:type="paragraph" w:customStyle="1" w:styleId="FirstParagraph">
     <w:name w:val="First Paragraph"/>
@@ -2325,6 +2324,48 @@
         <w:shd w:val="clear" w:color="auto" w:fill="C6D9F1" w:themeFill="text2" w:themeFillTint="33"/>
       </w:tcPr>
     </w:tblStylePr>
+  </w:style>
+  <w:style w:type="paragraph" w:customStyle="1" w:styleId="HeadingnoTOC">
+    <w:name w:val="Heading no TOC"/>
+    <w:basedOn w:val="Heading1"/>
+    <w:next w:val="BodyText"/>
+    <w:link w:val="HeadingnoTOCChar"/>
+    <w:qFormat/>
+    <w:rsid w:val="000C5FF3"/>
+    <w:pPr>
+      <w:outlineLvl w:val="9"/>
+    </w:pPr>
+  </w:style>
+  <w:style w:type="character" w:customStyle="1" w:styleId="Heading1Char">
+    <w:name w:val="Heading 1 Char"/>
+    <w:basedOn w:val="DefaultParagraphFont"/>
+    <w:link w:val="Heading1"/>
+    <w:uiPriority w:val="9"/>
+    <w:rsid w:val="000C5FF3"/>
+    <w:rPr>
+      <w:rFonts w:ascii="Roboto" w:eastAsiaTheme="majorEastAsia" w:hAnsi="Roboto" w:cstheme="majorBidi"/>
+      <w:b/>
+      <w:bCs/>
+      <w:color w:val="2E3192"/>
+      <w:sz w:val="32"/>
+      <w:szCs w:val="32"/>
+      <w:lang w:val="en-GB"/>
+    </w:rPr>
+  </w:style>
+  <w:style w:type="character" w:customStyle="1" w:styleId="HeadingnoTOCChar">
+    <w:name w:val="Heading no TOC Char"/>
+    <w:basedOn w:val="Heading1Char"/>
+    <w:link w:val="HeadingnoTOC"/>
+    <w:rsid w:val="000C5FF3"/>
+    <w:rPr>
+      <w:rFonts w:ascii="Roboto" w:eastAsiaTheme="majorEastAsia" w:hAnsi="Roboto" w:cstheme="majorBidi"/>
+      <w:b/>
+      <w:bCs/>
+      <w:color w:val="2E3192"/>
+      <w:sz w:val="32"/>
+      <w:szCs w:val="32"/>
+      <w:lang w:val="en-GB"/>
+    </w:rPr>
   </w:style>
 </w:styles>
 </file>

</xml_diff>

<commit_message>
numbered and non-numbered formatting
</commit_message>
<xml_diff>
--- a/inst/templates/styling/doc_template.docx
+++ b/inst/templates/styling/doc_template.docx
@@ -37,13 +37,51 @@
     </w:p>
     <w:p>
       <w:pPr>
-        <w:pStyle w:val="BodyText"/>
-      </w:pPr>
+        <w:pStyle w:val="HeadingnoTOC"/>
+      </w:pPr>
+      <w:r>
+        <w:t>Heading No TOC</w:t>
+      </w:r>
     </w:p>
     <w:p>
       <w:pPr>
-        <w:pStyle w:val="BodyText"/>
-      </w:pPr>
+        <w:pStyle w:val="Heading1nonumber"/>
+      </w:pPr>
+      <w:r>
+        <w:t>Heading 1</w:t>
+      </w:r>
+    </w:p>
+    <w:p>
+      <w:pPr>
+        <w:pStyle w:val="Heading2"/>
+      </w:pPr>
+      <w:r>
+        <w:t>Heading 2</w:t>
+      </w:r>
+    </w:p>
+    <w:p>
+      <w:pPr>
+        <w:pStyle w:val="Heading3"/>
+      </w:pPr>
+      <w:r>
+        <w:t>Heading 3</w:t>
+      </w:r>
+    </w:p>
+    <w:p>
+      <w:pPr>
+        <w:pStyle w:val="Heading1nonumber"/>
+      </w:pPr>
+      <w:r>
+        <w:t>Heading 1 no number</w:t>
+      </w:r>
+    </w:p>
+    <w:p>
+      <w:pPr>
+        <w:pStyle w:val="Heading2nonumber"/>
+      </w:pPr>
+      <w:r>
+        <w:t>Heading 2 no number</w:t>
+      </w:r>
     </w:p>
     <w:bookmarkEnd w:id="0"/>
     <w:p/>
@@ -98,31 +136,19 @@
           <w:tcPr>
             <w:tcW w:w="3262" w:type="dxa"/>
           </w:tcPr>
-          <w:p>
-            <w:pPr>
-              <w:pStyle w:val="Heading3"/>
-            </w:pPr>
-          </w:p>
+          <w:p/>
         </w:tc>
         <w:tc>
           <w:tcPr>
             <w:tcW w:w="3263" w:type="dxa"/>
           </w:tcPr>
-          <w:p>
-            <w:pPr>
-              <w:pStyle w:val="Heading3"/>
-            </w:pPr>
-          </w:p>
+          <w:p/>
         </w:tc>
         <w:tc>
           <w:tcPr>
             <w:tcW w:w="3263" w:type="dxa"/>
           </w:tcPr>
-          <w:p>
-            <w:pPr>
-              <w:pStyle w:val="Heading3"/>
-            </w:pPr>
-          </w:p>
+          <w:p/>
         </w:tc>
       </w:tr>
       <w:tr>
@@ -130,31 +156,19 @@
           <w:tcPr>
             <w:tcW w:w="3262" w:type="dxa"/>
           </w:tcPr>
-          <w:p>
-            <w:pPr>
-              <w:pStyle w:val="Heading3"/>
-            </w:pPr>
-          </w:p>
+          <w:p/>
         </w:tc>
         <w:tc>
           <w:tcPr>
             <w:tcW w:w="3263" w:type="dxa"/>
           </w:tcPr>
-          <w:p>
-            <w:pPr>
-              <w:pStyle w:val="Heading3"/>
-            </w:pPr>
-          </w:p>
+          <w:p/>
         </w:tc>
         <w:tc>
           <w:tcPr>
             <w:tcW w:w="3263" w:type="dxa"/>
           </w:tcPr>
-          <w:p>
-            <w:pPr>
-              <w:pStyle w:val="Heading3"/>
-            </w:pPr>
-          </w:p>
+          <w:p/>
         </w:tc>
       </w:tr>
       <w:tr>
@@ -165,31 +179,19 @@
           <w:tcPr>
             <w:tcW w:w="3262" w:type="dxa"/>
           </w:tcPr>
-          <w:p>
-            <w:pPr>
-              <w:pStyle w:val="Heading3"/>
-            </w:pPr>
-          </w:p>
+          <w:p/>
         </w:tc>
         <w:tc>
           <w:tcPr>
             <w:tcW w:w="3263" w:type="dxa"/>
           </w:tcPr>
-          <w:p>
-            <w:pPr>
-              <w:pStyle w:val="Heading3"/>
-            </w:pPr>
-          </w:p>
+          <w:p/>
         </w:tc>
         <w:tc>
           <w:tcPr>
             <w:tcW w:w="3263" w:type="dxa"/>
           </w:tcPr>
-          <w:p>
-            <w:pPr>
-              <w:pStyle w:val="Heading3"/>
-            </w:pPr>
-          </w:p>
+          <w:p/>
         </w:tc>
       </w:tr>
       <w:tr>
@@ -197,31 +199,19 @@
           <w:tcPr>
             <w:tcW w:w="3262" w:type="dxa"/>
           </w:tcPr>
-          <w:p>
-            <w:pPr>
-              <w:pStyle w:val="Heading3"/>
-            </w:pPr>
-          </w:p>
+          <w:p/>
         </w:tc>
         <w:tc>
           <w:tcPr>
             <w:tcW w:w="3263" w:type="dxa"/>
           </w:tcPr>
-          <w:p>
-            <w:pPr>
-              <w:pStyle w:val="Heading3"/>
-            </w:pPr>
-          </w:p>
+          <w:p/>
         </w:tc>
         <w:tc>
           <w:tcPr>
             <w:tcW w:w="3263" w:type="dxa"/>
           </w:tcPr>
-          <w:p>
-            <w:pPr>
-              <w:pStyle w:val="Heading3"/>
-            </w:pPr>
-          </w:p>
+          <w:p/>
         </w:tc>
       </w:tr>
     </w:tbl>
@@ -262,6 +252,13 @@
       </w:r>
     </w:p>
   </w:endnote>
+  <w:endnote w:type="continuationNotice" w:id="1">
+    <w:p>
+      <w:pPr>
+        <w:spacing w:after="0" w:line="240" w:lineRule="auto"/>
+      </w:pPr>
+    </w:p>
+  </w:endnote>
 </w:endnotes>
 </file>
 
@@ -286,7 +283,7 @@
         <w:noProof/>
       </w:rPr>
       <w:drawing>
-        <wp:anchor distT="0" distB="0" distL="114300" distR="114300" simplePos="0" relativeHeight="251675648" behindDoc="1" locked="0" layoutInCell="1" allowOverlap="1" wp14:anchorId="65AFB80A" wp14:editId="70909BC4">
+        <wp:anchor distT="0" distB="0" distL="114300" distR="114300" simplePos="0" relativeHeight="251658242" behindDoc="1" locked="0" layoutInCell="1" allowOverlap="1" wp14:anchorId="65AFB80A" wp14:editId="70909BC4">
           <wp:simplePos x="0" y="0"/>
           <wp:positionH relativeFrom="page">
             <wp:posOffset>4616450</wp:posOffset>
@@ -396,7 +393,7 @@
         <w:noProof/>
       </w:rPr>
       <w:drawing>
-        <wp:anchor distT="0" distB="0" distL="114300" distR="114300" simplePos="0" relativeHeight="251652096" behindDoc="0" locked="0" layoutInCell="1" allowOverlap="1" wp14:anchorId="2C17C15A" wp14:editId="1D02690B">
+        <wp:anchor distT="0" distB="0" distL="114300" distR="114300" simplePos="0" relativeHeight="251658240" behindDoc="0" locked="0" layoutInCell="1" allowOverlap="1" wp14:anchorId="2C17C15A" wp14:editId="1D02690B">
           <wp:simplePos x="0" y="0"/>
           <wp:positionH relativeFrom="column">
             <wp:posOffset>243205</wp:posOffset>
@@ -462,7 +459,7 @@
         <w:noProof/>
       </w:rPr>
       <w:drawing>
-        <wp:anchor distT="0" distB="0" distL="114300" distR="114300" simplePos="0" relativeHeight="251673600" behindDoc="0" locked="0" layoutInCell="1" allowOverlap="1" wp14:anchorId="3294EA72" wp14:editId="2A947969">
+        <wp:anchor distT="0" distB="0" distL="114300" distR="114300" simplePos="0" relativeHeight="251658241" behindDoc="0" locked="0" layoutInCell="1" allowOverlap="1" wp14:anchorId="3294EA72" wp14:editId="2A947969">
           <wp:simplePos x="0" y="0"/>
           <wp:positionH relativeFrom="column">
             <wp:posOffset>2237105</wp:posOffset>
@@ -522,7 +519,7 @@
         <w:noProof/>
       </w:rPr>
       <w:drawing>
-        <wp:anchor distT="0" distB="0" distL="114300" distR="114300" simplePos="0" relativeHeight="251695104" behindDoc="0" locked="0" layoutInCell="1" allowOverlap="1" wp14:anchorId="1CB6DCA8" wp14:editId="4682FF99">
+        <wp:anchor distT="0" distB="0" distL="114300" distR="114300" simplePos="0" relativeHeight="251658244" behindDoc="0" locked="0" layoutInCell="1" allowOverlap="1" wp14:anchorId="1CB6DCA8" wp14:editId="4682FF99">
           <wp:simplePos x="0" y="0"/>
           <wp:positionH relativeFrom="column">
             <wp:posOffset>5240655</wp:posOffset>
@@ -632,6 +629,13 @@
       </w:r>
     </w:p>
   </w:footnote>
+  <w:footnote w:type="continuationNotice" w:id="1">
+    <w:p>
+      <w:pPr>
+        <w:spacing w:after="0" w:line="240" w:lineRule="auto"/>
+      </w:pPr>
+    </w:p>
+  </w:footnote>
 </w:footnotes>
 </file>
 
@@ -646,7 +650,7 @@
         <w:noProof/>
       </w:rPr>
       <w:drawing>
-        <wp:anchor distT="0" distB="0" distL="114300" distR="114300" simplePos="0" relativeHeight="251696128" behindDoc="0" locked="0" layoutInCell="1" allowOverlap="1" wp14:anchorId="591B2C01" wp14:editId="4C9E50B3">
+        <wp:anchor distT="0" distB="0" distL="114300" distR="114300" simplePos="0" relativeHeight="251658245" behindDoc="0" locked="0" layoutInCell="1" allowOverlap="1" wp14:anchorId="591B2C01" wp14:editId="4C9E50B3">
           <wp:simplePos x="0" y="0"/>
           <wp:positionH relativeFrom="margin">
             <wp:posOffset>45220</wp:posOffset>
@@ -712,7 +716,7 @@
         <w:noProof/>
       </w:rPr>
       <w:drawing>
-        <wp:anchor distT="0" distB="0" distL="114300" distR="114300" simplePos="0" relativeHeight="251685888" behindDoc="1" locked="0" layoutInCell="1" allowOverlap="1" wp14:anchorId="70CC34E5" wp14:editId="3ABB69B8">
+        <wp:anchor distT="0" distB="0" distL="114300" distR="114300" simplePos="0" relativeHeight="251658243" behindDoc="1" locked="0" layoutInCell="1" allowOverlap="1" wp14:anchorId="70CC34E5" wp14:editId="3ABB69B8">
           <wp:simplePos x="0" y="0"/>
           <wp:positionH relativeFrom="column">
             <wp:posOffset>-499745</wp:posOffset>
@@ -1007,6 +1011,122 @@
       </w:pPr>
     </w:lvl>
   </w:abstractNum>
+  <w:abstractNum w:abstractNumId="3" w15:restartNumberingAfterBreak="0">
+    <w:nsid w:val="161B420A"/>
+    <w:multiLevelType w:val="multilevel"/>
+    <w:tmpl w:val="CFC2CD76"/>
+    <w:lvl w:ilvl="0">
+      <w:start w:val="1"/>
+      <w:numFmt w:val="decimal"/>
+      <w:pStyle w:val="Heading2"/>
+      <w:lvlText w:val="%1."/>
+      <w:lvlJc w:val="left"/>
+      <w:pPr>
+        <w:ind w:left="360" w:hanging="360"/>
+      </w:pPr>
+      <w:rPr>
+        <w:rFonts w:hint="default"/>
+      </w:rPr>
+    </w:lvl>
+    <w:lvl w:ilvl="1">
+      <w:start w:val="1"/>
+      <w:numFmt w:val="decimal"/>
+      <w:pStyle w:val="Heading3"/>
+      <w:lvlText w:val="%1.%2."/>
+      <w:lvlJc w:val="left"/>
+      <w:pPr>
+        <w:ind w:left="357" w:hanging="357"/>
+      </w:pPr>
+      <w:rPr>
+        <w:rFonts w:hint="default"/>
+      </w:rPr>
+    </w:lvl>
+    <w:lvl w:ilvl="2">
+      <w:start w:val="1"/>
+      <w:numFmt w:val="decimal"/>
+      <w:pStyle w:val="Heading4"/>
+      <w:lvlText w:val="%1.%2.%3."/>
+      <w:lvlJc w:val="left"/>
+      <w:pPr>
+        <w:ind w:left="357" w:hanging="357"/>
+      </w:pPr>
+      <w:rPr>
+        <w:rFonts w:hint="default"/>
+      </w:rPr>
+    </w:lvl>
+    <w:lvl w:ilvl="3">
+      <w:start w:val="1"/>
+      <w:numFmt w:val="decimal"/>
+      <w:lvlText w:val="%1.%2.%3.%4."/>
+      <w:lvlJc w:val="left"/>
+      <w:pPr>
+        <w:ind w:left="1728" w:hanging="648"/>
+      </w:pPr>
+      <w:rPr>
+        <w:rFonts w:hint="default"/>
+      </w:rPr>
+    </w:lvl>
+    <w:lvl w:ilvl="4">
+      <w:start w:val="1"/>
+      <w:numFmt w:val="decimal"/>
+      <w:lvlText w:val="%1.%2.%3.%4.%5."/>
+      <w:lvlJc w:val="left"/>
+      <w:pPr>
+        <w:ind w:left="2232" w:hanging="792"/>
+      </w:pPr>
+      <w:rPr>
+        <w:rFonts w:hint="default"/>
+      </w:rPr>
+    </w:lvl>
+    <w:lvl w:ilvl="5">
+      <w:start w:val="1"/>
+      <w:numFmt w:val="decimal"/>
+      <w:lvlText w:val="%1.%2.%3.%4.%5.%6."/>
+      <w:lvlJc w:val="left"/>
+      <w:pPr>
+        <w:ind w:left="2736" w:hanging="936"/>
+      </w:pPr>
+      <w:rPr>
+        <w:rFonts w:hint="default"/>
+      </w:rPr>
+    </w:lvl>
+    <w:lvl w:ilvl="6">
+      <w:start w:val="1"/>
+      <w:numFmt w:val="decimal"/>
+      <w:lvlText w:val="%1.%2.%3.%4.%5.%6.%7."/>
+      <w:lvlJc w:val="left"/>
+      <w:pPr>
+        <w:ind w:left="3240" w:hanging="1080"/>
+      </w:pPr>
+      <w:rPr>
+        <w:rFonts w:hint="default"/>
+      </w:rPr>
+    </w:lvl>
+    <w:lvl w:ilvl="7">
+      <w:start w:val="1"/>
+      <w:numFmt w:val="decimal"/>
+      <w:lvlText w:val="%1.%2.%3.%4.%5.%6.%7.%8."/>
+      <w:lvlJc w:val="left"/>
+      <w:pPr>
+        <w:ind w:left="3744" w:hanging="1224"/>
+      </w:pPr>
+      <w:rPr>
+        <w:rFonts w:hint="default"/>
+      </w:rPr>
+    </w:lvl>
+    <w:lvl w:ilvl="8">
+      <w:start w:val="1"/>
+      <w:numFmt w:val="decimal"/>
+      <w:lvlText w:val="%1.%2.%3.%4.%5.%6.%7.%8.%9."/>
+      <w:lvlJc w:val="left"/>
+      <w:pPr>
+        <w:ind w:left="4320" w:hanging="1440"/>
+      </w:pPr>
+      <w:rPr>
+        <w:rFonts w:hint="default"/>
+      </w:rPr>
+    </w:lvl>
+  </w:abstractNum>
   <w:num w:numId="1" w16cid:durableId="307173841">
     <w:abstractNumId w:val="0"/>
   </w:num>
@@ -1045,6 +1165,9 @@
   </w:num>
   <w:num w:numId="4" w16cid:durableId="52853844">
     <w:abstractNumId w:val="1"/>
+  </w:num>
+  <w:num w:numId="5" w16cid:durableId="135605407">
+    <w:abstractNumId w:val="3"/>
   </w:num>
 </w:numbering>
 </file>
@@ -1350,6 +1473,7 @@
     <w:name w:val="heading 2"/>
     <w:basedOn w:val="Normal"/>
     <w:next w:val="BodyText"/>
+    <w:link w:val="Heading2Char"/>
     <w:uiPriority w:val="9"/>
     <w:unhideWhenUsed/>
     <w:qFormat/>
@@ -1357,6 +1481,9 @@
     <w:pPr>
       <w:keepNext/>
       <w:keepLines/>
+      <w:numPr>
+        <w:numId w:val="5"/>
+      </w:numPr>
       <w:spacing w:before="200" w:after="0"/>
       <w:outlineLvl w:val="1"/>
     </w:pPr>
@@ -1380,6 +1507,10 @@
     <w:pPr>
       <w:keepNext/>
       <w:keepLines/>
+      <w:numPr>
+        <w:ilvl w:val="1"/>
+        <w:numId w:val="5"/>
+      </w:numPr>
       <w:spacing w:before="200" w:after="0"/>
       <w:outlineLvl w:val="2"/>
     </w:pPr>
@@ -1399,6 +1530,10 @@
     <w:pPr>
       <w:keepNext/>
       <w:keepLines/>
+      <w:numPr>
+        <w:ilvl w:val="2"/>
+        <w:numId w:val="5"/>
+      </w:numPr>
       <w:spacing w:before="200" w:after="0"/>
       <w:outlineLvl w:val="3"/>
     </w:pPr>
@@ -1758,8 +1893,10 @@
   <w:style w:type="paragraph" w:customStyle="1" w:styleId="TableCaption">
     <w:name w:val="Table Caption"/>
     <w:basedOn w:val="Caption"/>
+    <w:rsid w:val="00E76E95"/>
     <w:pPr>
       <w:keepNext/>
+      <w:keepLines/>
     </w:pPr>
   </w:style>
   <w:style w:type="paragraph" w:customStyle="1" w:styleId="ImageCaption">
@@ -1769,13 +1906,15 @@
   <w:style w:type="paragraph" w:customStyle="1" w:styleId="Figure">
     <w:name w:val="Figure"/>
     <w:basedOn w:val="Normal"/>
+    <w:rsid w:val="00E76E95"/>
+    <w:pPr>
+      <w:keepNext/>
+      <w:spacing w:after="120" w:line="240" w:lineRule="auto"/>
+    </w:pPr>
   </w:style>
   <w:style w:type="paragraph" w:customStyle="1" w:styleId="CaptionedFigure">
     <w:name w:val="Captioned Figure"/>
     <w:basedOn w:val="Figure"/>
-    <w:pPr>
-      <w:keepNext/>
-    </w:pPr>
   </w:style>
   <w:style w:type="character" w:customStyle="1" w:styleId="CaptionChar">
     <w:name w:val="Caption Char"/>
@@ -2331,7 +2470,7 @@
     <w:next w:val="BodyText"/>
     <w:link w:val="HeadingnoTOCChar"/>
     <w:qFormat/>
-    <w:rsid w:val="000C5FF3"/>
+    <w:rsid w:val="009D1398"/>
     <w:pPr>
       <w:outlineLvl w:val="9"/>
     </w:pPr>
@@ -2364,6 +2503,71 @@
       <w:color w:val="2E3192"/>
       <w:sz w:val="32"/>
       <w:szCs w:val="32"/>
+      <w:lang w:val="en-GB"/>
+    </w:rPr>
+  </w:style>
+  <w:style w:type="paragraph" w:customStyle="1" w:styleId="Heading1nonumber">
+    <w:name w:val="Heading 1 no number"/>
+    <w:basedOn w:val="Heading1"/>
+    <w:link w:val="Heading1nonumberChar"/>
+    <w:qFormat/>
+    <w:rsid w:val="00E47312"/>
+  </w:style>
+  <w:style w:type="character" w:customStyle="1" w:styleId="Heading1nonumberChar">
+    <w:name w:val="Heading 1 no number Char"/>
+    <w:basedOn w:val="Heading1Char"/>
+    <w:link w:val="Heading1nonumber"/>
+    <w:rsid w:val="00E47312"/>
+    <w:rPr>
+      <w:rFonts w:ascii="Roboto" w:eastAsiaTheme="majorEastAsia" w:hAnsi="Roboto" w:cstheme="majorBidi"/>
+      <w:b/>
+      <w:bCs/>
+      <w:color w:val="2E3192"/>
+      <w:sz w:val="32"/>
+      <w:szCs w:val="32"/>
+      <w:lang w:val="en-GB"/>
+    </w:rPr>
+  </w:style>
+  <w:style w:type="paragraph" w:customStyle="1" w:styleId="Heading2nonumber">
+    <w:name w:val="Heading 2 no number"/>
+    <w:basedOn w:val="Heading2"/>
+    <w:link w:val="Heading2nonumberChar"/>
+    <w:qFormat/>
+    <w:rsid w:val="00E47312"/>
+    <w:pPr>
+      <w:numPr>
+        <w:numId w:val="0"/>
+      </w:numPr>
+    </w:pPr>
+  </w:style>
+  <w:style w:type="character" w:customStyle="1" w:styleId="Heading2Char">
+    <w:name w:val="Heading 2 Char"/>
+    <w:basedOn w:val="DefaultParagraphFont"/>
+    <w:link w:val="Heading2"/>
+    <w:uiPriority w:val="9"/>
+    <w:rsid w:val="00E47312"/>
+    <w:rPr>
+      <w:rFonts w:ascii="Roboto" w:eastAsiaTheme="majorEastAsia" w:hAnsi="Roboto" w:cstheme="majorBidi"/>
+      <w:b/>
+      <w:bCs/>
+      <w:color w:val="016BB2"/>
+      <w:sz w:val="28"/>
+      <w:szCs w:val="28"/>
+      <w:lang w:val="en-GB"/>
+    </w:rPr>
+  </w:style>
+  <w:style w:type="character" w:customStyle="1" w:styleId="Heading2nonumberChar">
+    <w:name w:val="Heading 2 no number Char"/>
+    <w:basedOn w:val="Heading2Char"/>
+    <w:link w:val="Heading2nonumber"/>
+    <w:rsid w:val="00E47312"/>
+    <w:rPr>
+      <w:rFonts w:ascii="Roboto" w:eastAsiaTheme="majorEastAsia" w:hAnsi="Roboto" w:cstheme="majorBidi"/>
+      <w:b/>
+      <w:bCs/>
+      <w:color w:val="016BB2"/>
+      <w:sz w:val="28"/>
+      <w:szCs w:val="28"/>
       <w:lang w:val="en-GB"/>
     </w:rPr>
   </w:style>

</xml_diff>

<commit_message>
change stock to svg for space saving
</commit_message>
<xml_diff>
--- a/inst/templates/styling/doc_template.docx
+++ b/inst/templates/styling/doc_template.docx
@@ -393,6 +393,66 @@
         <w:noProof/>
       </w:rPr>
       <w:drawing>
+        <wp:anchor distT="0" distB="0" distL="114300" distR="114300" simplePos="0" relativeHeight="251658245" behindDoc="0" locked="0" layoutInCell="1" allowOverlap="1" wp14:anchorId="591B2C01" wp14:editId="14D70ADD">
+          <wp:simplePos x="0" y="0"/>
+          <wp:positionH relativeFrom="margin">
+            <wp:posOffset>49530</wp:posOffset>
+          </wp:positionH>
+          <wp:positionV relativeFrom="paragraph">
+            <wp:posOffset>-3482340</wp:posOffset>
+          </wp:positionV>
+          <wp:extent cx="6121400" cy="1605915"/>
+          <wp:effectExtent l="0" t="0" r="0" b="0"/>
+          <wp:wrapNone/>
+          <wp:docPr id="1836182661" name="Picture"/>
+          <wp:cNvGraphicFramePr/>
+          <a:graphic xmlns:a="http://schemas.openxmlformats.org/drawingml/2006/main">
+            <a:graphicData uri="http://schemas.openxmlformats.org/drawingml/2006/picture">
+              <pic:pic xmlns:pic="http://schemas.openxmlformats.org/drawingml/2006/picture">
+                <pic:nvPicPr>
+                  <pic:cNvPr id="1836182661" name="Picture"/>
+                  <pic:cNvPicPr>
+                    <a:picLocks noChangeAspect="1" noChangeArrowheads="1"/>
+                  </pic:cNvPicPr>
+                </pic:nvPicPr>
+                <pic:blipFill>
+                  <a:blip r:embed="rId1">
+                    <a:extLst>
+                      <a:ext uri="{96DAC541-7B7A-43D3-8B79-37D633B846F1}">
+                        <asvg:svgBlip xmlns:asvg="http://schemas.microsoft.com/office/drawing/2016/SVG/main" r:embed="rId2"/>
+                      </a:ext>
+                    </a:extLst>
+                  </a:blip>
+                  <a:stretch>
+                    <a:fillRect/>
+                  </a:stretch>
+                </pic:blipFill>
+                <pic:spPr bwMode="auto">
+                  <a:xfrm>
+                    <a:off x="0" y="0"/>
+                    <a:ext cx="6121400" cy="1605915"/>
+                  </a:xfrm>
+                  <a:prstGeom prst="rect">
+                    <a:avLst/>
+                  </a:prstGeom>
+                </pic:spPr>
+              </pic:pic>
+            </a:graphicData>
+          </a:graphic>
+          <wp14:sizeRelH relativeFrom="margin">
+            <wp14:pctWidth>0</wp14:pctWidth>
+          </wp14:sizeRelH>
+          <wp14:sizeRelV relativeFrom="margin">
+            <wp14:pctHeight>0</wp14:pctHeight>
+          </wp14:sizeRelV>
+        </wp:anchor>
+      </w:drawing>
+    </w:r>
+    <w:r>
+      <w:rPr>
+        <w:noProof/>
+      </w:rPr>
+      <w:drawing>
         <wp:anchor distT="0" distB="0" distL="114300" distR="114300" simplePos="0" relativeHeight="251658240" behindDoc="0" locked="0" layoutInCell="1" allowOverlap="1" wp14:anchorId="2C17C15A" wp14:editId="1D02690B">
           <wp:simplePos x="0" y="0"/>
           <wp:positionH relativeFrom="column">
@@ -416,7 +476,7 @@
                   </pic:cNvPicPr>
                 </pic:nvPicPr>
                 <pic:blipFill>
-                  <a:blip r:embed="rId1">
+                  <a:blip r:embed="rId3">
                     <a:extLst>
                       <a:ext uri="{28A0092B-C50C-407E-A947-70E740481C1C}">
                         <a14:useLocalDpi xmlns:a14="http://schemas.microsoft.com/office/drawing/2010/main" val="0"/>
@@ -482,7 +542,7 @@
                   </pic:cNvPicPr>
                 </pic:nvPicPr>
                 <pic:blipFill>
-                  <a:blip r:embed="rId2">
+                  <a:blip r:embed="rId4">
                     <a:extLst>
                       <a:ext uri="{28A0092B-C50C-407E-A947-70E740481C1C}">
                         <a14:useLocalDpi xmlns:a14="http://schemas.microsoft.com/office/drawing/2010/main" val="0"/>
@@ -542,7 +602,7 @@
                   </pic:cNvPicPr>
                 </pic:nvPicPr>
                 <pic:blipFill>
-                  <a:blip r:embed="rId3">
+                  <a:blip r:embed="rId5">
                     <a:extLst>
                       <a:ext uri="{28A0092B-C50C-407E-A947-70E740481C1C}">
                         <a14:useLocalDpi xmlns:a14="http://schemas.microsoft.com/office/drawing/2010/main" val="0"/>
@@ -650,73 +710,7 @@
         <w:noProof/>
       </w:rPr>
       <w:drawing>
-        <wp:anchor distT="0" distB="0" distL="114300" distR="114300" simplePos="0" relativeHeight="251658245" behindDoc="0" locked="0" layoutInCell="1" allowOverlap="1" wp14:anchorId="591B2C01" wp14:editId="4C9E50B3">
-          <wp:simplePos x="0" y="0"/>
-          <wp:positionH relativeFrom="margin">
-            <wp:posOffset>45220</wp:posOffset>
-          </wp:positionH>
-          <wp:positionV relativeFrom="paragraph">
-            <wp:posOffset>3655890</wp:posOffset>
-          </wp:positionV>
-          <wp:extent cx="6097136" cy="2438646"/>
-          <wp:effectExtent l="0" t="0" r="0" b="0"/>
-          <wp:wrapNone/>
-          <wp:docPr id="1836182661" name="Picture" descr="A group of people jumping&#10;&#10;Description automatically generated"/>
-          <wp:cNvGraphicFramePr/>
-          <a:graphic xmlns:a="http://schemas.openxmlformats.org/drawingml/2006/main">
-            <a:graphicData uri="http://schemas.openxmlformats.org/drawingml/2006/picture">
-              <pic:pic xmlns:pic="http://schemas.openxmlformats.org/drawingml/2006/picture">
-                <pic:nvPicPr>
-                  <pic:cNvPr id="1836182661" name="Picture" descr="A group of people jumping&#10;&#10;Description automatically generated"/>
-                  <pic:cNvPicPr>
-                    <a:picLocks noChangeAspect="1" noChangeArrowheads="1"/>
-                  </pic:cNvPicPr>
-                </pic:nvPicPr>
-                <pic:blipFill>
-                  <a:blip r:embed="rId1">
-                    <a:extLst>
-                      <a:ext uri="{28A0092B-C50C-407E-A947-70E740481C1C}">
-                        <a14:useLocalDpi xmlns:a14="http://schemas.microsoft.com/office/drawing/2010/main" val="0"/>
-                      </a:ext>
-                    </a:extLst>
-                  </a:blip>
-                  <a:stretch>
-                    <a:fillRect/>
-                  </a:stretch>
-                </pic:blipFill>
-                <pic:spPr bwMode="auto">
-                  <a:xfrm>
-                    <a:off x="0" y="0"/>
-                    <a:ext cx="6121431" cy="2448363"/>
-                  </a:xfrm>
-                  <a:prstGeom prst="rect">
-                    <a:avLst/>
-                  </a:prstGeom>
-                  <a:noFill/>
-                  <a:ln w="9525">
-                    <a:noFill/>
-                    <a:headEnd/>
-                    <a:tailEnd/>
-                  </a:ln>
-                </pic:spPr>
-              </pic:pic>
-            </a:graphicData>
-          </a:graphic>
-          <wp14:sizeRelH relativeFrom="margin">
-            <wp14:pctWidth>0</wp14:pctWidth>
-          </wp14:sizeRelH>
-          <wp14:sizeRelV relativeFrom="margin">
-            <wp14:pctHeight>0</wp14:pctHeight>
-          </wp14:sizeRelV>
-        </wp:anchor>
-      </w:drawing>
-    </w:r>
-    <w:r>
-      <w:rPr>
-        <w:noProof/>
-      </w:rPr>
-      <w:drawing>
-        <wp:anchor distT="0" distB="0" distL="114300" distR="114300" simplePos="0" relativeHeight="251658243" behindDoc="1" locked="0" layoutInCell="1" allowOverlap="1" wp14:anchorId="70CC34E5" wp14:editId="3ABB69B8">
+        <wp:anchor distT="0" distB="0" distL="114300" distR="114300" simplePos="0" relativeHeight="251658243" behindDoc="1" locked="0" layoutInCell="1" allowOverlap="1" wp14:anchorId="70CC34E5" wp14:editId="09F42B64">
           <wp:simplePos x="0" y="0"/>
           <wp:positionH relativeFrom="column">
             <wp:posOffset>-499745</wp:posOffset>
@@ -739,7 +733,7 @@
                   <pic:cNvPicPr/>
                 </pic:nvPicPr>
                 <pic:blipFill>
-                  <a:blip r:embed="rId2">
+                  <a:blip r:embed="rId1">
                     <a:extLst>
                       <a:ext uri="{28A0092B-C50C-407E-A947-70E740481C1C}">
                         <a14:useLocalDpi xmlns:a14="http://schemas.microsoft.com/office/drawing/2010/main" val="0"/>

</xml_diff>

<commit_message>
tweaked margins to try and show multiple plots per page
</commit_message>
<xml_diff>
--- a/inst/templates/styling/doc_template.docx
+++ b/inst/templates/styling/doc_template.docx
@@ -221,7 +221,7 @@
       <w:headerReference w:type="first" r:id="rId9"/>
       <w:footerReference w:type="first" r:id="rId10"/>
       <w:pgSz w:w="11906" w:h="16838" w:code="9"/>
-      <w:pgMar w:top="1440" w:right="1077" w:bottom="1440" w:left="1077" w:header="3402" w:footer="1191" w:gutter="0"/>
+      <w:pgMar w:top="1077" w:right="1077" w:bottom="1440" w:left="1077" w:header="3402" w:footer="1191" w:gutter="0"/>
       <w:cols w:space="720"/>
       <w:titlePg/>
       <w:docGrid w:linePitch="326"/>
@@ -264,11 +264,6 @@
 
 <file path=word/footer1.xml><?xml version="1.0" encoding="utf-8"?>
 <w:ftr xmlns:wpc="http://schemas.microsoft.com/office/word/2010/wordprocessingCanvas" xmlns:cx="http://schemas.microsoft.com/office/drawing/2014/chartex" xmlns:cx1="http://schemas.microsoft.com/office/drawing/2015/9/8/chartex" xmlns:cx2="http://schemas.microsoft.com/office/drawing/2015/10/21/chartex" xmlns:cx3="http://schemas.microsoft.com/office/drawing/2016/5/9/chartex" xmlns:cx4="http://schemas.microsoft.com/office/drawing/2016/5/10/chartex" xmlns:cx5="http://schemas.microsoft.com/office/drawing/2016/5/11/chartex" xmlns:cx6="http://schemas.microsoft.com/office/drawing/2016/5/12/chartex" xmlns:cx7="http://schemas.microsoft.com/office/drawing/2016/5/13/chartex" xmlns:cx8="http://schemas.microsoft.com/office/drawing/2016/5/14/chartex" xmlns:mc="http://schemas.openxmlformats.org/markup-compatibility/2006" xmlns:aink="http://schemas.microsoft.com/office/drawing/2016/ink" xmlns:am3d="http://schemas.microsoft.com/office/drawing/2017/model3d" xmlns:o="urn:schemas-microsoft-com:office:office" xmlns:oel="http://schemas.microsoft.com/office/2019/extlst" xmlns:r="http://schemas.openxmlformats.org/officeDocument/2006/relationships" xmlns:m="http://schemas.openxmlformats.org/officeDocument/2006/math" xmlns:v="urn:schemas-microsoft-com:vml" xmlns:wp14="http://schemas.microsoft.com/office/word/2010/wordprocessingDrawing" xmlns:wp="http://schemas.openxmlformats.org/drawingml/2006/wordprocessingDrawing" xmlns:w10="urn:schemas-microsoft-com:office:word" xmlns:w="http://schemas.openxmlformats.org/wordprocessingml/2006/main" xmlns:w14="http://schemas.microsoft.com/office/word/2010/wordml" xmlns:w15="http://schemas.microsoft.com/office/word/2012/wordml" xmlns:w16cex="http://schemas.microsoft.com/office/word/2018/wordml/cex" xmlns:w16cid="http://schemas.microsoft.com/office/word/2016/wordml/cid" xmlns:w16="http://schemas.microsoft.com/office/word/2018/wordml" xmlns:w16du="http://schemas.microsoft.com/office/word/2023/wordml/word16du" xmlns:w16sdtdh="http://schemas.microsoft.com/office/word/2020/wordml/sdtdatahash" xmlns:w16se="http://schemas.microsoft.com/office/word/2015/wordml/symex" xmlns:wpg="http://schemas.microsoft.com/office/word/2010/wordprocessingGroup" xmlns:wpi="http://schemas.microsoft.com/office/word/2010/wordprocessingInk" xmlns:wne="http://schemas.microsoft.com/office/word/2006/wordml" xmlns:wps="http://schemas.microsoft.com/office/word/2010/wordprocessingShape" mc:Ignorable="w14 w15 w16se w16cid w16 w16cex w16sdtdh w16du wp14">
-  <w:p>
-    <w:pPr>
-      <w:pStyle w:val="Footer"/>
-    </w:pPr>
-  </w:p>
   <w:p>
     <w:pPr>
       <w:pStyle w:val="Footer"/>
@@ -294,7 +289,7 @@
           <wp:extent cx="2934000" cy="1486800"/>
           <wp:effectExtent l="0" t="0" r="0" b="0"/>
           <wp:wrapNone/>
-          <wp:docPr id="882454950" name="Picture 1" descr="A blue and black background&#10;&#10;Description automatically generated"/>
+          <wp:docPr id="352562881" name="Picture 1" descr="A blue and black background&#10;&#10;Description automatically generated"/>
           <wp:cNvGraphicFramePr>
             <a:graphicFrameLocks xmlns:a="http://schemas.openxmlformats.org/drawingml/2006/main" noChangeAspect="1"/>
           </wp:cNvGraphicFramePr>
@@ -404,7 +399,7 @@
           <wp:extent cx="6121400" cy="1605915"/>
           <wp:effectExtent l="0" t="0" r="0" b="0"/>
           <wp:wrapNone/>
-          <wp:docPr id="1836182661" name="Picture"/>
+          <wp:docPr id="431129682" name="Picture"/>
           <wp:cNvGraphicFramePr/>
           <a:graphic xmlns:a="http://schemas.openxmlformats.org/drawingml/2006/main">
             <a:graphicData uri="http://schemas.openxmlformats.org/drawingml/2006/picture">
@@ -464,7 +459,7 @@
           <wp:extent cx="2037080" cy="474980"/>
           <wp:effectExtent l="0" t="0" r="0" b="0"/>
           <wp:wrapNone/>
-          <wp:docPr id="1558707177" name="Picture" descr="A close-up of a sign&#10;&#10;Description automatically generated"/>
+          <wp:docPr id="581664613" name="Picture" descr="A close-up of a sign&#10;&#10;Description automatically generated"/>
           <wp:cNvGraphicFramePr/>
           <a:graphic xmlns:a="http://schemas.openxmlformats.org/drawingml/2006/main">
             <a:graphicData uri="http://schemas.openxmlformats.org/drawingml/2006/picture">
@@ -530,7 +525,7 @@
           <wp:extent cx="2768600" cy="476250"/>
           <wp:effectExtent l="0" t="0" r="0" b="0"/>
           <wp:wrapNone/>
-          <wp:docPr id="1401390926" name="Picture" descr="A logo with blue text&#10;&#10;Description automatically generated"/>
+          <wp:docPr id="1204003528" name="Picture" descr="A logo with blue text&#10;&#10;Description automatically generated"/>
           <wp:cNvGraphicFramePr/>
           <a:graphic xmlns:a="http://schemas.openxmlformats.org/drawingml/2006/main">
             <a:graphicData uri="http://schemas.openxmlformats.org/drawingml/2006/picture">
@@ -590,7 +585,7 @@
           <wp:extent cx="507365" cy="762000"/>
           <wp:effectExtent l="0" t="0" r="0" b="0"/>
           <wp:wrapNone/>
-          <wp:docPr id="219726832" name="Picture" descr="A logo for a health and leisure company&#10;&#10;Description automatically generated"/>
+          <wp:docPr id="30542333" name="Picture" descr="A logo for a health and leisure company&#10;&#10;Description automatically generated"/>
           <wp:cNvGraphicFramePr/>
           <a:graphic xmlns:a="http://schemas.openxmlformats.org/drawingml/2006/main">
             <a:graphicData uri="http://schemas.openxmlformats.org/drawingml/2006/picture">
@@ -721,7 +716,7 @@
           <wp:extent cx="2148840" cy="1009650"/>
           <wp:effectExtent l="0" t="0" r="0" b="0"/>
           <wp:wrapNone/>
-          <wp:docPr id="1136162921" name="Picture 2"/>
+          <wp:docPr id="409128323" name="Picture 2"/>
           <wp:cNvGraphicFramePr>
             <a:graphicFrameLocks xmlns:a="http://schemas.openxmlformats.org/drawingml/2006/main" noChangeAspect="1"/>
           </wp:cNvGraphicFramePr>

</xml_diff>

<commit_message>
replace bibtex with numbered refs
</commit_message>
<xml_diff>
--- a/inst/templates/styling/doc_template.docx
+++ b/inst/templates/styling/doc_template.docx
@@ -216,6 +216,37 @@
       </w:tr>
     </w:tbl>
     <w:p/>
+    <w:p>
+      <w:pPr>
+        <w:pStyle w:val="Heading1nonumber"/>
+      </w:pPr>
+      <w:r>
+        <w:lastRenderedPageBreak/>
+        <w:t>REFERENCES style</w:t>
+      </w:r>
+    </w:p>
+    <w:p>
+      <w:pPr>
+        <w:pStyle w:val="ReferencesList"/>
+      </w:pPr>
+      <w:r>
+        <w:t>Testing numbers</w:t>
+      </w:r>
+    </w:p>
+    <w:p>
+      <w:pPr>
+        <w:pStyle w:val="ReferencesList"/>
+      </w:pPr>
+      <w:r>
+        <w:t xml:space="preserve">To </w:t>
+      </w:r>
+      <w:r>
+        <w:t>make sure these</w:t>
+      </w:r>
+      <w:r>
+        <w:t xml:space="preserve"> work</w:t>
+      </w:r>
+    </w:p>
     <w:sectPr>
       <w:footerReference w:type="default" r:id="rId8"/>
       <w:headerReference w:type="first" r:id="rId9"/>
@@ -1012,6 +1043,97 @@
     </w:lvl>
   </w:abstractNum>
   <w:abstractNum w:abstractNumId="3" w15:restartNumberingAfterBreak="0">
+    <w:nsid w:val="02E654B9"/>
+    <w:multiLevelType w:val="hybridMultilevel"/>
+    <w:tmpl w:val="09EC036E"/>
+    <w:lvl w:ilvl="0" w:tplc="F7AAC5FE">
+      <w:start w:val="1"/>
+      <w:numFmt w:val="decimal"/>
+      <w:pStyle w:val="ReferencesList"/>
+      <w:lvlText w:val="%1."/>
+      <w:lvlJc w:val="left"/>
+      <w:pPr>
+        <w:ind w:left="720" w:hanging="360"/>
+      </w:pPr>
+      <w:rPr>
+        <w:rFonts w:hint="default"/>
+        <w:vertAlign w:val="superscript"/>
+      </w:rPr>
+    </w:lvl>
+    <w:lvl w:ilvl="1" w:tplc="08090019" w:tentative="1">
+      <w:start w:val="1"/>
+      <w:numFmt w:val="lowerLetter"/>
+      <w:lvlText w:val="%2."/>
+      <w:lvlJc w:val="left"/>
+      <w:pPr>
+        <w:ind w:left="1440" w:hanging="360"/>
+      </w:pPr>
+    </w:lvl>
+    <w:lvl w:ilvl="2" w:tplc="0809001B" w:tentative="1">
+      <w:start w:val="1"/>
+      <w:numFmt w:val="lowerRoman"/>
+      <w:lvlText w:val="%3."/>
+      <w:lvlJc w:val="right"/>
+      <w:pPr>
+        <w:ind w:left="2160" w:hanging="180"/>
+      </w:pPr>
+    </w:lvl>
+    <w:lvl w:ilvl="3" w:tplc="0809000F" w:tentative="1">
+      <w:start w:val="1"/>
+      <w:numFmt w:val="decimal"/>
+      <w:lvlText w:val="%4."/>
+      <w:lvlJc w:val="left"/>
+      <w:pPr>
+        <w:ind w:left="2880" w:hanging="360"/>
+      </w:pPr>
+    </w:lvl>
+    <w:lvl w:ilvl="4" w:tplc="08090019" w:tentative="1">
+      <w:start w:val="1"/>
+      <w:numFmt w:val="lowerLetter"/>
+      <w:lvlText w:val="%5."/>
+      <w:lvlJc w:val="left"/>
+      <w:pPr>
+        <w:ind w:left="3600" w:hanging="360"/>
+      </w:pPr>
+    </w:lvl>
+    <w:lvl w:ilvl="5" w:tplc="0809001B" w:tentative="1">
+      <w:start w:val="1"/>
+      <w:numFmt w:val="lowerRoman"/>
+      <w:lvlText w:val="%6."/>
+      <w:lvlJc w:val="right"/>
+      <w:pPr>
+        <w:ind w:left="4320" w:hanging="180"/>
+      </w:pPr>
+    </w:lvl>
+    <w:lvl w:ilvl="6" w:tplc="0809000F" w:tentative="1">
+      <w:start w:val="1"/>
+      <w:numFmt w:val="decimal"/>
+      <w:lvlText w:val="%7."/>
+      <w:lvlJc w:val="left"/>
+      <w:pPr>
+        <w:ind w:left="5040" w:hanging="360"/>
+      </w:pPr>
+    </w:lvl>
+    <w:lvl w:ilvl="7" w:tplc="08090019" w:tentative="1">
+      <w:start w:val="1"/>
+      <w:numFmt w:val="lowerLetter"/>
+      <w:lvlText w:val="%8."/>
+      <w:lvlJc w:val="left"/>
+      <w:pPr>
+        <w:ind w:left="5760" w:hanging="360"/>
+      </w:pPr>
+    </w:lvl>
+    <w:lvl w:ilvl="8" w:tplc="0809001B" w:tentative="1">
+      <w:start w:val="1"/>
+      <w:numFmt w:val="lowerRoman"/>
+      <w:lvlText w:val="%9."/>
+      <w:lvlJc w:val="right"/>
+      <w:pPr>
+        <w:ind w:left="6480" w:hanging="180"/>
+      </w:pPr>
+    </w:lvl>
+  </w:abstractNum>
+  <w:abstractNum w:abstractNumId="4" w15:restartNumberingAfterBreak="0">
     <w:nsid w:val="161B420A"/>
     <w:multiLevelType w:val="multilevel"/>
     <w:tmpl w:val="CFC2CD76"/>
@@ -1167,6 +1289,9 @@
     <w:abstractNumId w:val="1"/>
   </w:num>
   <w:num w:numId="5" w16cid:durableId="135605407">
+    <w:abstractNumId w:val="4"/>
+  </w:num>
+  <w:num w:numId="6" w16cid:durableId="1117986053">
     <w:abstractNumId w:val="3"/>
   </w:num>
 </w:numbering>
@@ -1638,7 +1763,6 @@
   <w:style w:type="character" w:default="1" w:styleId="DefaultParagraphFont">
     <w:name w:val="Default Paragraph Font"/>
     <w:uiPriority w:val="1"/>
-    <w:semiHidden/>
     <w:unhideWhenUsed/>
   </w:style>
   <w:style w:type="table" w:default="1" w:styleId="TableNormal">
@@ -2569,6 +2693,31 @@
       <w:sz w:val="28"/>
       <w:szCs w:val="28"/>
       <w:lang w:val="en-GB"/>
+    </w:rPr>
+  </w:style>
+  <w:style w:type="paragraph" w:styleId="ListParagraph">
+    <w:name w:val="List Paragraph"/>
+    <w:basedOn w:val="Normal"/>
+    <w:rsid w:val="00985C42"/>
+    <w:pPr>
+      <w:ind w:left="720"/>
+      <w:contextualSpacing/>
+    </w:pPr>
+  </w:style>
+  <w:style w:type="paragraph" w:customStyle="1" w:styleId="ReferencesList">
+    <w:name w:val="References List"/>
+    <w:basedOn w:val="ListParagraph"/>
+    <w:qFormat/>
+    <w:rsid w:val="00A5014E"/>
+    <w:pPr>
+      <w:numPr>
+        <w:numId w:val="6"/>
+      </w:numPr>
+      <w:ind w:left="142" w:hanging="142"/>
+    </w:pPr>
+    <w:rPr>
+      <w:sz w:val="20"/>
+      <w:szCs w:val="20"/>
     </w:rPr>
   </w:style>
 </w:styles>

</xml_diff>

<commit_message>
Tidied graphs to fit 2 on page
</commit_message>
<xml_diff>
--- a/inst/templates/styling/doc_template.docx
+++ b/inst/templates/styling/doc_template.docx
@@ -33,6 +33,14 @@
     <w:p>
       <w:r>
         <w:t>We wish to thank the Health Behaviour in School-aged Children (HBSC) Survey team and all Scottish schools and pupils who took part in the 2022 HBSC Survey. The HBSC Scotland study is funded by Public Health Scotland. Thank you to the Children's Society for allowing us to use the Good Childhood Index. We also thank colleagues based at the Public Health Research Facility at the MRC/CSO Social and Public Health Sciences Unit (University of Glasgow) for their work on developing the online survey and reporting portal. The SHINE project was originally funded by the MRC Mental Health Data Pathfinder (2018-2021) and is now funded by Medical Research Council core funding to Social and Public Health Sciences Unit at the University of Glasgow with contributions from some individual local authorities.</w:t>
+      </w:r>
+    </w:p>
+    <w:p>
+      <w:pPr>
+        <w:pStyle w:val="Figure"/>
+      </w:pPr>
+      <w:r>
+        <w:t>Figure style</w:t>
       </w:r>
     </w:p>
     <w:p>
@@ -304,11 +312,6 @@
     <w:pPr>
       <w:pStyle w:val="Footer"/>
     </w:pPr>
-  </w:p>
-  <w:p>
-    <w:pPr>
-      <w:pStyle w:val="Footer"/>
-    </w:pPr>
     <w:r>
       <w:rPr>
         <w:noProof/>
@@ -424,24 +427,24 @@
         <w:noProof/>
       </w:rPr>
       <w:drawing>
-        <wp:anchor distT="0" distB="0" distL="114300" distR="114300" simplePos="0" relativeHeight="251658240" behindDoc="0" locked="0" layoutInCell="1" allowOverlap="1" wp14:anchorId="2C17C15A" wp14:editId="1D02690B">
+        <wp:anchor distT="0" distB="0" distL="114300" distR="114300" simplePos="0" relativeHeight="251691520" behindDoc="0" locked="0" layoutInCell="1" allowOverlap="1" wp14:anchorId="1CB6DCA8" wp14:editId="69622E0A">
           <wp:simplePos x="0" y="0"/>
           <wp:positionH relativeFrom="column">
-            <wp:posOffset>243205</wp:posOffset>
+            <wp:posOffset>4173855</wp:posOffset>
           </wp:positionH>
           <wp:positionV relativeFrom="paragraph">
-            <wp:posOffset>-1048385</wp:posOffset>
+            <wp:posOffset>-1191895</wp:posOffset>
           </wp:positionV>
-          <wp:extent cx="2037080" cy="474980"/>
+          <wp:extent cx="507365" cy="762000"/>
           <wp:effectExtent l="0" t="0" r="0" b="0"/>
           <wp:wrapNone/>
-          <wp:docPr id="1558707177" name="Picture" descr="A close-up of a sign&#10;&#10;Description automatically generated"/>
+          <wp:docPr id="219726832" name="Picture" descr="A logo for a health and leisure company&#10;&#10;Description automatically generated"/>
           <wp:cNvGraphicFramePr/>
           <a:graphic xmlns:a="http://schemas.openxmlformats.org/drawingml/2006/main">
             <a:graphicData uri="http://schemas.openxmlformats.org/drawingml/2006/picture">
               <pic:pic xmlns:pic="http://schemas.openxmlformats.org/drawingml/2006/picture">
                 <pic:nvPicPr>
-                  <pic:cNvPr id="1558707177" name="Picture" descr="A close-up of a sign&#10;&#10;Description automatically generated"/>
+                  <pic:cNvPr id="219726832" name="Picture" descr="A logo for a health and leisure company&#10;&#10;Description automatically generated"/>
                   <pic:cNvPicPr>
                     <a:picLocks noChangeAspect="1" noChangeArrowheads="1"/>
                   </pic:cNvPicPr>
@@ -461,7 +464,7 @@
                 <pic:spPr bwMode="auto">
                   <a:xfrm>
                     <a:off x="0" y="0"/>
-                    <a:ext cx="2037080" cy="474980"/>
+                    <a:ext cx="507365" cy="762000"/>
                   </a:xfrm>
                   <a:prstGeom prst="rect">
                     <a:avLst/>
@@ -476,12 +479,6 @@
               </pic:pic>
             </a:graphicData>
           </a:graphic>
-          <wp14:sizeRelH relativeFrom="margin">
-            <wp14:pctWidth>0</wp14:pctWidth>
-          </wp14:sizeRelH>
-          <wp14:sizeRelV relativeFrom="margin">
-            <wp14:pctHeight>0</wp14:pctHeight>
-          </wp14:sizeRelV>
         </wp:anchor>
       </w:drawing>
     </w:r>
@@ -490,10 +487,10 @@
         <w:noProof/>
       </w:rPr>
       <w:drawing>
-        <wp:anchor distT="0" distB="0" distL="114300" distR="114300" simplePos="0" relativeHeight="251658241" behindDoc="0" locked="0" layoutInCell="1" allowOverlap="1" wp14:anchorId="3294EA72" wp14:editId="2A947969">
+        <wp:anchor distT="0" distB="0" distL="114300" distR="114300" simplePos="0" relativeHeight="251657728" behindDoc="0" locked="0" layoutInCell="1" allowOverlap="1" wp14:anchorId="3294EA72" wp14:editId="71530BF8">
           <wp:simplePos x="0" y="0"/>
           <wp:positionH relativeFrom="column">
-            <wp:posOffset>2237105</wp:posOffset>
+            <wp:posOffset>1170612</wp:posOffset>
           </wp:positionH>
           <wp:positionV relativeFrom="paragraph">
             <wp:posOffset>-1049020</wp:posOffset>
@@ -528,66 +525,6 @@
                   <a:xfrm>
                     <a:off x="0" y="0"/>
                     <a:ext cx="2768600" cy="476250"/>
-                  </a:xfrm>
-                  <a:prstGeom prst="rect">
-                    <a:avLst/>
-                  </a:prstGeom>
-                  <a:noFill/>
-                  <a:ln w="9525">
-                    <a:noFill/>
-                    <a:headEnd/>
-                    <a:tailEnd/>
-                  </a:ln>
-                </pic:spPr>
-              </pic:pic>
-            </a:graphicData>
-          </a:graphic>
-        </wp:anchor>
-      </w:drawing>
-    </w:r>
-    <w:r>
-      <w:rPr>
-        <w:noProof/>
-      </w:rPr>
-      <w:drawing>
-        <wp:anchor distT="0" distB="0" distL="114300" distR="114300" simplePos="0" relativeHeight="251658244" behindDoc="0" locked="0" layoutInCell="1" allowOverlap="1" wp14:anchorId="1CB6DCA8" wp14:editId="4682FF99">
-          <wp:simplePos x="0" y="0"/>
-          <wp:positionH relativeFrom="column">
-            <wp:posOffset>5240655</wp:posOffset>
-          </wp:positionH>
-          <wp:positionV relativeFrom="paragraph">
-            <wp:posOffset>-1191895</wp:posOffset>
-          </wp:positionV>
-          <wp:extent cx="507365" cy="762000"/>
-          <wp:effectExtent l="0" t="0" r="0" b="0"/>
-          <wp:wrapNone/>
-          <wp:docPr id="219726832" name="Picture" descr="A logo for a health and leisure company&#10;&#10;Description automatically generated"/>
-          <wp:cNvGraphicFramePr/>
-          <a:graphic xmlns:a="http://schemas.openxmlformats.org/drawingml/2006/main">
-            <a:graphicData uri="http://schemas.openxmlformats.org/drawingml/2006/picture">
-              <pic:pic xmlns:pic="http://schemas.openxmlformats.org/drawingml/2006/picture">
-                <pic:nvPicPr>
-                  <pic:cNvPr id="219726832" name="Picture" descr="A logo for a health and leisure company&#10;&#10;Description automatically generated"/>
-                  <pic:cNvPicPr>
-                    <a:picLocks noChangeAspect="1" noChangeArrowheads="1"/>
-                  </pic:cNvPicPr>
-                </pic:nvPicPr>
-                <pic:blipFill>
-                  <a:blip r:embed="rId3">
-                    <a:extLst>
-                      <a:ext uri="{28A0092B-C50C-407E-A947-70E740481C1C}">
-                        <a14:useLocalDpi xmlns:a14="http://schemas.microsoft.com/office/drawing/2010/main" val="0"/>
-                      </a:ext>
-                    </a:extLst>
-                  </a:blip>
-                  <a:stretch>
-                    <a:fillRect/>
-                  </a:stretch>
-                </pic:blipFill>
-                <pic:spPr bwMode="auto">
-                  <a:xfrm>
-                    <a:off x="0" y="0"/>
-                    <a:ext cx="507365" cy="762000"/>
                   </a:xfrm>
                   <a:prstGeom prst="rect">
                     <a:avLst/>
@@ -1763,6 +1700,7 @@
   <w:style w:type="character" w:default="1" w:styleId="DefaultParagraphFont">
     <w:name w:val="Default Paragraph Font"/>
     <w:uiPriority w:val="1"/>
+    <w:semiHidden/>
     <w:unhideWhenUsed/>
   </w:style>
   <w:style w:type="table" w:default="1" w:styleId="TableNormal">
@@ -2030,10 +1968,9 @@
   <w:style w:type="paragraph" w:customStyle="1" w:styleId="Figure">
     <w:name w:val="Figure"/>
     <w:basedOn w:val="Normal"/>
-    <w:rsid w:val="00E76E95"/>
-    <w:pPr>
-      <w:keepNext/>
-      <w:spacing w:after="120" w:line="240" w:lineRule="auto"/>
+    <w:rsid w:val="00CC1096"/>
+    <w:pPr>
+      <w:spacing w:after="0" w:line="240" w:lineRule="auto"/>
     </w:pPr>
   </w:style>
   <w:style w:type="paragraph" w:customStyle="1" w:styleId="CaptionedFigure">

</xml_diff>

<commit_message>
fig captions at top (but in wrong places)
</commit_message>
<xml_diff>
--- a/inst/templates/styling/doc_template.docx
+++ b/inst/templates/styling/doc_template.docx
@@ -41,6 +41,22 @@
       </w:pPr>
       <w:r>
         <w:t>Figure style</w:t>
+      </w:r>
+    </w:p>
+    <w:p>
+      <w:pPr>
+        <w:pStyle w:val="ImageCaption"/>
+      </w:pPr>
+      <w:r>
+        <w:t>Fig caption</w:t>
+      </w:r>
+    </w:p>
+    <w:p>
+      <w:pPr>
+        <w:pStyle w:val="TableCaption"/>
+      </w:pPr>
+      <w:r>
+        <w:t>Tab caption</w:t>
       </w:r>
     </w:p>
     <w:p>
@@ -229,7 +245,6 @@
         <w:pStyle w:val="Heading1nonumber"/>
       </w:pPr>
       <w:r>
-        <w:lastRenderedPageBreak/>
         <w:t>REFERENCES style</w:t>
       </w:r>
     </w:p>
@@ -1964,6 +1979,11 @@
   <w:style w:type="paragraph" w:customStyle="1" w:styleId="ImageCaption">
     <w:name w:val="Image Caption"/>
     <w:basedOn w:val="Caption"/>
+    <w:rsid w:val="006F7998"/>
+    <w:pPr>
+      <w:keepNext/>
+      <w:spacing w:after="0" w:line="240" w:lineRule="auto"/>
+    </w:pPr>
   </w:style>
   <w:style w:type="paragraph" w:customStyle="1" w:styleId="Figure">
     <w:name w:val="Figure"/>

</xml_diff>

<commit_message>
test changing style of table
</commit_message>
<xml_diff>
--- a/inst/templates/styling/doc_template.docx
+++ b/inst/templates/styling/doc_template.docx
@@ -2660,6 +2660,39 @@
       <w:sz w:val="20"/>
       <w:szCs w:val="20"/>
     </w:rPr>
+  </w:style>
+  <w:style w:type="table" w:customStyle="1" w:styleId="ShineTable">
+    <w:name w:val="ShineTable"/>
+    <w:basedOn w:val="Table"/>
+    <w:uiPriority w:val="99"/>
+    <w:rsid w:val="00040598"/>
+    <w:pPr>
+      <w:spacing w:after="0"/>
+    </w:pPr>
+    <w:tblPr/>
+    <w:tblStylePr w:type="firstRow">
+      <w:rPr>
+        <w:b/>
+      </w:rPr>
+      <w:tblPr>
+        <w:jc w:val="left"/>
+      </w:tblPr>
+      <w:trPr>
+        <w:jc w:val="left"/>
+      </w:trPr>
+      <w:tcPr>
+        <w:tcBorders>
+          <w:bottom w:val="single" w:sz="0" w:space="0" w:color="auto"/>
+        </w:tcBorders>
+        <w:vAlign w:val="bottom"/>
+      </w:tcPr>
+    </w:tblStylePr>
+    <w:tblStylePr w:type="band2Horz">
+      <w:tblPr/>
+      <w:tcPr>
+        <w:shd w:val="clear" w:color="auto" w:fill="D9E2F3"/>
+      </w:tcPr>
+    </w:tblStylePr>
   </w:style>
 </w:styles>
 </file>

</xml_diff>

<commit_message>
tidied capitalisation of heading 1s
</commit_message>
<xml_diff>
--- a/inst/templates/styling/doc_template.docx
+++ b/inst/templates/styling/doc_template.docx
@@ -1514,7 +1514,7 @@
     <w:link w:val="Heading1Char"/>
     <w:uiPriority w:val="9"/>
     <w:qFormat/>
-    <w:rsid w:val="00F635E9"/>
+    <w:rsid w:val="00172FD7"/>
     <w:pPr>
       <w:keepNext/>
       <w:keepLines/>
@@ -1525,6 +1525,7 @@
       <w:rFonts w:eastAsiaTheme="majorEastAsia" w:cstheme="majorBidi"/>
       <w:b/>
       <w:bCs/>
+      <w:caps/>
       <w:color w:val="2E3192"/>
       <w:sz w:val="32"/>
       <w:szCs w:val="32"/>
@@ -2545,11 +2546,12 @@
     <w:basedOn w:val="DefaultParagraphFont"/>
     <w:link w:val="Heading1"/>
     <w:uiPriority w:val="9"/>
-    <w:rsid w:val="000C5FF3"/>
+    <w:rsid w:val="00172FD7"/>
     <w:rPr>
       <w:rFonts w:ascii="Roboto" w:eastAsiaTheme="majorEastAsia" w:hAnsi="Roboto" w:cstheme="majorBidi"/>
       <w:b/>
       <w:bCs/>
+      <w:caps/>
       <w:color w:val="2E3192"/>
       <w:sz w:val="32"/>
       <w:szCs w:val="32"/>
@@ -2565,6 +2567,7 @@
       <w:rFonts w:ascii="Roboto" w:eastAsiaTheme="majorEastAsia" w:hAnsi="Roboto" w:cstheme="majorBidi"/>
       <w:b/>
       <w:bCs/>
+      <w:caps/>
       <w:color w:val="2E3192"/>
       <w:sz w:val="32"/>
       <w:szCs w:val="32"/>
@@ -2587,6 +2590,7 @@
       <w:rFonts w:ascii="Roboto" w:eastAsiaTheme="majorEastAsia" w:hAnsi="Roboto" w:cstheme="majorBidi"/>
       <w:b/>
       <w:bCs/>
+      <w:caps/>
       <w:color w:val="2E3192"/>
       <w:sz w:val="32"/>
       <w:szCs w:val="32"/>

</xml_diff>

<commit_message>
doc formats - not TOC for question headings
</commit_message>
<xml_diff>
--- a/inst/templates/styling/doc_template.docx
+++ b/inst/templates/styling/doc_template.docx
@@ -105,6 +105,14 @@
       </w:pPr>
       <w:r>
         <w:t>Heading 2 no number</w:t>
+      </w:r>
+    </w:p>
+    <w:p>
+      <w:pPr>
+        <w:pStyle w:val="Heading2NoTOC"/>
+      </w:pPr>
+      <w:r>
+        <w:t>Heading 2 No TOC</w:t>
       </w:r>
     </w:p>
     <w:bookmarkEnd w:id="0"/>
@@ -2536,10 +2544,13 @@
     <w:next w:val="BodyText"/>
     <w:link w:val="HeadingnoTOCChar"/>
     <w:qFormat/>
-    <w:rsid w:val="009D1398"/>
+    <w:rsid w:val="009D5208"/>
     <w:pPr>
       <w:outlineLvl w:val="9"/>
     </w:pPr>
+    <w:rPr>
+      <w:caps w:val="0"/>
+    </w:rPr>
   </w:style>
   <w:style w:type="character" w:customStyle="1" w:styleId="Heading1Char">
     <w:name w:val="Heading 1 Char"/>
@@ -2562,12 +2573,12 @@
     <w:name w:val="Heading no TOC Char"/>
     <w:basedOn w:val="Heading1Char"/>
     <w:link w:val="HeadingnoTOC"/>
-    <w:rsid w:val="000C5FF3"/>
+    <w:rsid w:val="009D5208"/>
     <w:rPr>
       <w:rFonts w:ascii="Roboto" w:eastAsiaTheme="majorEastAsia" w:hAnsi="Roboto" w:cstheme="majorBidi"/>
       <w:b/>
       <w:bCs/>
-      <w:caps/>
+      <w:caps w:val="0"/>
       <w:color w:val="2E3192"/>
       <w:sz w:val="32"/>
       <w:szCs w:val="32"/>
@@ -2697,6 +2708,31 @@
         <w:shd w:val="clear" w:color="auto" w:fill="D9E2F3"/>
       </w:tcPr>
     </w:tblStylePr>
+  </w:style>
+  <w:style w:type="paragraph" w:customStyle="1" w:styleId="Heading2NoTOC">
+    <w:name w:val="Heading 2 No TOC"/>
+    <w:basedOn w:val="Heading2nonumber"/>
+    <w:link w:val="Heading2NoTOCChar"/>
+    <w:qFormat/>
+    <w:rsid w:val="009D5208"/>
+    <w:pPr>
+      <w:outlineLvl w:val="9"/>
+    </w:pPr>
+  </w:style>
+  <w:style w:type="character" w:customStyle="1" w:styleId="Heading2NoTOCChar">
+    <w:name w:val="Heading 2 No TOC Char"/>
+    <w:basedOn w:val="Heading2nonumberChar"/>
+    <w:link w:val="Heading2NoTOC"/>
+    <w:rsid w:val="009D5208"/>
+    <w:rPr>
+      <w:rFonts w:ascii="Roboto" w:eastAsiaTheme="majorEastAsia" w:hAnsi="Roboto" w:cstheme="majorBidi"/>
+      <w:b/>
+      <w:bCs/>
+      <w:color w:val="016BB2"/>
+      <w:sz w:val="28"/>
+      <w:szCs w:val="28"/>
+      <w:lang w:val="en-GB"/>
+    </w:rPr>
   </w:style>
 </w:styles>
 </file>

</xml_diff>

<commit_message>
SHINE report updates to change the acknowledgements text, update cover images and reduce size of SH chart.
</commit_message>
<xml_diff>
--- a/inst/templates/styling/doc_template.docx
+++ b/inst/templates/styling/doc_template.docx
@@ -1,6 +1,6 @@
 
 <file path=word/document.xml><?xml version="1.0" encoding="utf-8"?>
-<w:document xmlns:wpc="http://schemas.microsoft.com/office/word/2010/wordprocessingCanvas" xmlns:cx="http://schemas.microsoft.com/office/drawing/2014/chartex" xmlns:cx1="http://schemas.microsoft.com/office/drawing/2015/9/8/chartex" xmlns:cx2="http://schemas.microsoft.com/office/drawing/2015/10/21/chartex" xmlns:cx3="http://schemas.microsoft.com/office/drawing/2016/5/9/chartex" xmlns:cx4="http://schemas.microsoft.com/office/drawing/2016/5/10/chartex" xmlns:cx5="http://schemas.microsoft.com/office/drawing/2016/5/11/chartex" xmlns:cx6="http://schemas.microsoft.com/office/drawing/2016/5/12/chartex" xmlns:cx7="http://schemas.microsoft.com/office/drawing/2016/5/13/chartex" xmlns:cx8="http://schemas.microsoft.com/office/drawing/2016/5/14/chartex" xmlns:mc="http://schemas.openxmlformats.org/markup-compatibility/2006" xmlns:aink="http://schemas.microsoft.com/office/drawing/2016/ink" xmlns:am3d="http://schemas.microsoft.com/office/drawing/2017/model3d" xmlns:o="urn:schemas-microsoft-com:office:office" xmlns:oel="http://schemas.microsoft.com/office/2019/extlst" xmlns:r="http://schemas.openxmlformats.org/officeDocument/2006/relationships" xmlns:m="http://schemas.openxmlformats.org/officeDocument/2006/math" xmlns:v="urn:schemas-microsoft-com:vml" xmlns:wp14="http://schemas.microsoft.com/office/word/2010/wordprocessingDrawing" xmlns:wp="http://schemas.openxmlformats.org/drawingml/2006/wordprocessingDrawing" xmlns:w10="urn:schemas-microsoft-com:office:word" xmlns:w="http://schemas.openxmlformats.org/wordprocessingml/2006/main" xmlns:w14="http://schemas.microsoft.com/office/word/2010/wordml" xmlns:w15="http://schemas.microsoft.com/office/word/2012/wordml" xmlns:w16cex="http://schemas.microsoft.com/office/word/2018/wordml/cex" xmlns:w16cid="http://schemas.microsoft.com/office/word/2016/wordml/cid" xmlns:w16="http://schemas.microsoft.com/office/word/2018/wordml" xmlns:w16du="http://schemas.microsoft.com/office/word/2023/wordml/word16du" xmlns:w16sdtdh="http://schemas.microsoft.com/office/word/2020/wordml/sdtdatahash" xmlns:w16se="http://schemas.microsoft.com/office/word/2015/wordml/symex" xmlns:wpg="http://schemas.microsoft.com/office/word/2010/wordprocessingGroup" xmlns:wpi="http://schemas.microsoft.com/office/word/2010/wordprocessingInk" xmlns:wne="http://schemas.microsoft.com/office/word/2006/wordml" xmlns:wps="http://schemas.microsoft.com/office/word/2010/wordprocessingShape" mc:Ignorable="w14 w15 w16se w16cid w16 w16cex w16sdtdh w16du wp14">
+<w:document xmlns:wpc="http://schemas.microsoft.com/office/word/2010/wordprocessingCanvas" xmlns:cx="http://schemas.microsoft.com/office/drawing/2014/chartex" xmlns:cx1="http://schemas.microsoft.com/office/drawing/2015/9/8/chartex" xmlns:cx2="http://schemas.microsoft.com/office/drawing/2015/10/21/chartex" xmlns:cx3="http://schemas.microsoft.com/office/drawing/2016/5/9/chartex" xmlns:cx4="http://schemas.microsoft.com/office/drawing/2016/5/10/chartex" xmlns:cx5="http://schemas.microsoft.com/office/drawing/2016/5/11/chartex" xmlns:cx6="http://schemas.microsoft.com/office/drawing/2016/5/12/chartex" xmlns:cx7="http://schemas.microsoft.com/office/drawing/2016/5/13/chartex" xmlns:cx8="http://schemas.microsoft.com/office/drawing/2016/5/14/chartex" xmlns:mc="http://schemas.openxmlformats.org/markup-compatibility/2006" xmlns:aink="http://schemas.microsoft.com/office/drawing/2016/ink" xmlns:am3d="http://schemas.microsoft.com/office/drawing/2017/model3d" xmlns:o="urn:schemas-microsoft-com:office:office" xmlns:oel="http://schemas.microsoft.com/office/2019/extlst" xmlns:r="http://schemas.openxmlformats.org/officeDocument/2006/relationships" xmlns:m="http://schemas.openxmlformats.org/officeDocument/2006/math" xmlns:v="urn:schemas-microsoft-com:vml" xmlns:wp14="http://schemas.microsoft.com/office/word/2010/wordprocessingDrawing" xmlns:wp="http://schemas.openxmlformats.org/drawingml/2006/wordprocessingDrawing" xmlns:w10="urn:schemas-microsoft-com:office:word" xmlns:w="http://schemas.openxmlformats.org/wordprocessingml/2006/main" xmlns:w14="http://schemas.microsoft.com/office/word/2010/wordml" xmlns:w15="http://schemas.microsoft.com/office/word/2012/wordml" xmlns:w16cex="http://schemas.microsoft.com/office/word/2018/wordml/cex" xmlns:w16cid="http://schemas.microsoft.com/office/word/2016/wordml/cid" xmlns:w16="http://schemas.microsoft.com/office/word/2018/wordml" xmlns:w16du="http://schemas.microsoft.com/office/word/2023/wordml/word16du" xmlns:w16sdtdh="http://schemas.microsoft.com/office/word/2020/wordml/sdtdatahash" xmlns:w16sdtfl="http://schemas.microsoft.com/office/word/2024/wordml/sdtformatlock" xmlns:w16se="http://schemas.microsoft.com/office/word/2015/wordml/symex" xmlns:wpg="http://schemas.microsoft.com/office/word/2010/wordprocessingGroup" xmlns:wpi="http://schemas.microsoft.com/office/word/2010/wordprocessingInk" xmlns:wne="http://schemas.microsoft.com/office/word/2006/wordml" xmlns:wps="http://schemas.microsoft.com/office/word/2010/wordprocessingShape" mc:Ignorable="w14 w15 w16se w16cid w16 w16cex w16sdtdh w16sdtfl w16du wp14">
   <w:body>
     <w:p>
       <w:pPr>
@@ -293,7 +293,7 @@
 </file>
 
 <file path=word/endnotes.xml><?xml version="1.0" encoding="utf-8"?>
-<w:endnotes xmlns:wpc="http://schemas.microsoft.com/office/word/2010/wordprocessingCanvas" xmlns:cx="http://schemas.microsoft.com/office/drawing/2014/chartex" xmlns:cx1="http://schemas.microsoft.com/office/drawing/2015/9/8/chartex" xmlns:cx2="http://schemas.microsoft.com/office/drawing/2015/10/21/chartex" xmlns:cx3="http://schemas.microsoft.com/office/drawing/2016/5/9/chartex" xmlns:cx4="http://schemas.microsoft.com/office/drawing/2016/5/10/chartex" xmlns:cx5="http://schemas.microsoft.com/office/drawing/2016/5/11/chartex" xmlns:cx6="http://schemas.microsoft.com/office/drawing/2016/5/12/chartex" xmlns:cx7="http://schemas.microsoft.com/office/drawing/2016/5/13/chartex" xmlns:cx8="http://schemas.microsoft.com/office/drawing/2016/5/14/chartex" xmlns:mc="http://schemas.openxmlformats.org/markup-compatibility/2006" xmlns:aink="http://schemas.microsoft.com/office/drawing/2016/ink" xmlns:am3d="http://schemas.microsoft.com/office/drawing/2017/model3d" xmlns:o="urn:schemas-microsoft-com:office:office" xmlns:oel="http://schemas.microsoft.com/office/2019/extlst" xmlns:r="http://schemas.openxmlformats.org/officeDocument/2006/relationships" xmlns:m="http://schemas.openxmlformats.org/officeDocument/2006/math" xmlns:v="urn:schemas-microsoft-com:vml" xmlns:wp14="http://schemas.microsoft.com/office/word/2010/wordprocessingDrawing" xmlns:wp="http://schemas.openxmlformats.org/drawingml/2006/wordprocessingDrawing" xmlns:w10="urn:schemas-microsoft-com:office:word" xmlns:w="http://schemas.openxmlformats.org/wordprocessingml/2006/main" xmlns:w14="http://schemas.microsoft.com/office/word/2010/wordml" xmlns:w15="http://schemas.microsoft.com/office/word/2012/wordml" xmlns:w16cex="http://schemas.microsoft.com/office/word/2018/wordml/cex" xmlns:w16cid="http://schemas.microsoft.com/office/word/2016/wordml/cid" xmlns:w16="http://schemas.microsoft.com/office/word/2018/wordml" xmlns:w16du="http://schemas.microsoft.com/office/word/2023/wordml/word16du" xmlns:w16sdtdh="http://schemas.microsoft.com/office/word/2020/wordml/sdtdatahash" xmlns:w16se="http://schemas.microsoft.com/office/word/2015/wordml/symex" xmlns:wpg="http://schemas.microsoft.com/office/word/2010/wordprocessingGroup" xmlns:wpi="http://schemas.microsoft.com/office/word/2010/wordprocessingInk" xmlns:wne="http://schemas.microsoft.com/office/word/2006/wordml" xmlns:wps="http://schemas.microsoft.com/office/word/2010/wordprocessingShape" mc:Ignorable="w14 w15 w16se w16cid w16 w16cex w16sdtdh w16du wp14">
+<w:endnotes xmlns:wpc="http://schemas.microsoft.com/office/word/2010/wordprocessingCanvas" xmlns:cx="http://schemas.microsoft.com/office/drawing/2014/chartex" xmlns:cx1="http://schemas.microsoft.com/office/drawing/2015/9/8/chartex" xmlns:cx2="http://schemas.microsoft.com/office/drawing/2015/10/21/chartex" xmlns:cx3="http://schemas.microsoft.com/office/drawing/2016/5/9/chartex" xmlns:cx4="http://schemas.microsoft.com/office/drawing/2016/5/10/chartex" xmlns:cx5="http://schemas.microsoft.com/office/drawing/2016/5/11/chartex" xmlns:cx6="http://schemas.microsoft.com/office/drawing/2016/5/12/chartex" xmlns:cx7="http://schemas.microsoft.com/office/drawing/2016/5/13/chartex" xmlns:cx8="http://schemas.microsoft.com/office/drawing/2016/5/14/chartex" xmlns:mc="http://schemas.openxmlformats.org/markup-compatibility/2006" xmlns:aink="http://schemas.microsoft.com/office/drawing/2016/ink" xmlns:am3d="http://schemas.microsoft.com/office/drawing/2017/model3d" xmlns:o="urn:schemas-microsoft-com:office:office" xmlns:oel="http://schemas.microsoft.com/office/2019/extlst" xmlns:r="http://schemas.openxmlformats.org/officeDocument/2006/relationships" xmlns:m="http://schemas.openxmlformats.org/officeDocument/2006/math" xmlns:v="urn:schemas-microsoft-com:vml" xmlns:wp14="http://schemas.microsoft.com/office/word/2010/wordprocessingDrawing" xmlns:wp="http://schemas.openxmlformats.org/drawingml/2006/wordprocessingDrawing" xmlns:w10="urn:schemas-microsoft-com:office:word" xmlns:w="http://schemas.openxmlformats.org/wordprocessingml/2006/main" xmlns:w14="http://schemas.microsoft.com/office/word/2010/wordml" xmlns:w15="http://schemas.microsoft.com/office/word/2012/wordml" xmlns:w16cex="http://schemas.microsoft.com/office/word/2018/wordml/cex" xmlns:w16cid="http://schemas.microsoft.com/office/word/2016/wordml/cid" xmlns:w16="http://schemas.microsoft.com/office/word/2018/wordml" xmlns:w16du="http://schemas.microsoft.com/office/word/2023/wordml/word16du" xmlns:w16sdtdh="http://schemas.microsoft.com/office/word/2020/wordml/sdtdatahash" xmlns:w16sdtfl="http://schemas.microsoft.com/office/word/2024/wordml/sdtformatlock" xmlns:w16se="http://schemas.microsoft.com/office/word/2015/wordml/symex" xmlns:wpg="http://schemas.microsoft.com/office/word/2010/wordprocessingGroup" xmlns:wpi="http://schemas.microsoft.com/office/word/2010/wordprocessingInk" xmlns:wne="http://schemas.microsoft.com/office/word/2006/wordml" xmlns:wps="http://schemas.microsoft.com/office/word/2010/wordprocessingShape" mc:Ignorable="w14 w15 w16se w16cid w16 w16cex w16sdtdh w16sdtfl w16du wp14">
   <w:endnote w:type="separator" w:id="-1">
     <w:p>
       <w:pPr>
@@ -325,7 +325,7 @@
 </file>
 
 <file path=word/footer1.xml><?xml version="1.0" encoding="utf-8"?>
-<w:ftr xmlns:wpc="http://schemas.microsoft.com/office/word/2010/wordprocessingCanvas" xmlns:cx="http://schemas.microsoft.com/office/drawing/2014/chartex" xmlns:cx1="http://schemas.microsoft.com/office/drawing/2015/9/8/chartex" xmlns:cx2="http://schemas.microsoft.com/office/drawing/2015/10/21/chartex" xmlns:cx3="http://schemas.microsoft.com/office/drawing/2016/5/9/chartex" xmlns:cx4="http://schemas.microsoft.com/office/drawing/2016/5/10/chartex" xmlns:cx5="http://schemas.microsoft.com/office/drawing/2016/5/11/chartex" xmlns:cx6="http://schemas.microsoft.com/office/drawing/2016/5/12/chartex" xmlns:cx7="http://schemas.microsoft.com/office/drawing/2016/5/13/chartex" xmlns:cx8="http://schemas.microsoft.com/office/drawing/2016/5/14/chartex" xmlns:mc="http://schemas.openxmlformats.org/markup-compatibility/2006" xmlns:aink="http://schemas.microsoft.com/office/drawing/2016/ink" xmlns:am3d="http://schemas.microsoft.com/office/drawing/2017/model3d" xmlns:o="urn:schemas-microsoft-com:office:office" xmlns:oel="http://schemas.microsoft.com/office/2019/extlst" xmlns:r="http://schemas.openxmlformats.org/officeDocument/2006/relationships" xmlns:m="http://schemas.openxmlformats.org/officeDocument/2006/math" xmlns:v="urn:schemas-microsoft-com:vml" xmlns:wp14="http://schemas.microsoft.com/office/word/2010/wordprocessingDrawing" xmlns:wp="http://schemas.openxmlformats.org/drawingml/2006/wordprocessingDrawing" xmlns:w10="urn:schemas-microsoft-com:office:word" xmlns:w="http://schemas.openxmlformats.org/wordprocessingml/2006/main" xmlns:w14="http://schemas.microsoft.com/office/word/2010/wordml" xmlns:w15="http://schemas.microsoft.com/office/word/2012/wordml" xmlns:w16cex="http://schemas.microsoft.com/office/word/2018/wordml/cex" xmlns:w16cid="http://schemas.microsoft.com/office/word/2016/wordml/cid" xmlns:w16="http://schemas.microsoft.com/office/word/2018/wordml" xmlns:w16du="http://schemas.microsoft.com/office/word/2023/wordml/word16du" xmlns:w16sdtdh="http://schemas.microsoft.com/office/word/2020/wordml/sdtdatahash" xmlns:w16se="http://schemas.microsoft.com/office/word/2015/wordml/symex" xmlns:wpg="http://schemas.microsoft.com/office/word/2010/wordprocessingGroup" xmlns:wpi="http://schemas.microsoft.com/office/word/2010/wordprocessingInk" xmlns:wne="http://schemas.microsoft.com/office/word/2006/wordml" xmlns:wps="http://schemas.microsoft.com/office/word/2010/wordprocessingShape" mc:Ignorable="w14 w15 w16se w16cid w16 w16cex w16sdtdh w16du wp14">
+<w:ftr xmlns:wpc="http://schemas.microsoft.com/office/word/2010/wordprocessingCanvas" xmlns:cx="http://schemas.microsoft.com/office/drawing/2014/chartex" xmlns:cx1="http://schemas.microsoft.com/office/drawing/2015/9/8/chartex" xmlns:cx2="http://schemas.microsoft.com/office/drawing/2015/10/21/chartex" xmlns:cx3="http://schemas.microsoft.com/office/drawing/2016/5/9/chartex" xmlns:cx4="http://schemas.microsoft.com/office/drawing/2016/5/10/chartex" xmlns:cx5="http://schemas.microsoft.com/office/drawing/2016/5/11/chartex" xmlns:cx6="http://schemas.microsoft.com/office/drawing/2016/5/12/chartex" xmlns:cx7="http://schemas.microsoft.com/office/drawing/2016/5/13/chartex" xmlns:cx8="http://schemas.microsoft.com/office/drawing/2016/5/14/chartex" xmlns:mc="http://schemas.openxmlformats.org/markup-compatibility/2006" xmlns:aink="http://schemas.microsoft.com/office/drawing/2016/ink" xmlns:am3d="http://schemas.microsoft.com/office/drawing/2017/model3d" xmlns:o="urn:schemas-microsoft-com:office:office" xmlns:oel="http://schemas.microsoft.com/office/2019/extlst" xmlns:r="http://schemas.openxmlformats.org/officeDocument/2006/relationships" xmlns:m="http://schemas.openxmlformats.org/officeDocument/2006/math" xmlns:v="urn:schemas-microsoft-com:vml" xmlns:wp14="http://schemas.microsoft.com/office/word/2010/wordprocessingDrawing" xmlns:wp="http://schemas.openxmlformats.org/drawingml/2006/wordprocessingDrawing" xmlns:w10="urn:schemas-microsoft-com:office:word" xmlns:w="http://schemas.openxmlformats.org/wordprocessingml/2006/main" xmlns:w14="http://schemas.microsoft.com/office/word/2010/wordml" xmlns:w15="http://schemas.microsoft.com/office/word/2012/wordml" xmlns:w16cex="http://schemas.microsoft.com/office/word/2018/wordml/cex" xmlns:w16cid="http://schemas.microsoft.com/office/word/2016/wordml/cid" xmlns:w16="http://schemas.microsoft.com/office/word/2018/wordml" xmlns:w16du="http://schemas.microsoft.com/office/word/2023/wordml/word16du" xmlns:w16sdtdh="http://schemas.microsoft.com/office/word/2020/wordml/sdtdatahash" xmlns:w16sdtfl="http://schemas.microsoft.com/office/word/2024/wordml/sdtformatlock" xmlns:w16se="http://schemas.microsoft.com/office/word/2015/wordml/symex" xmlns:wpg="http://schemas.microsoft.com/office/word/2010/wordprocessingGroup" xmlns:wpi="http://schemas.microsoft.com/office/word/2010/wordprocessingInk" xmlns:wne="http://schemas.microsoft.com/office/word/2006/wordml" xmlns:wps="http://schemas.microsoft.com/office/word/2010/wordprocessingShape" mc:Ignorable="w14 w15 w16se w16cid w16 w16cex w16sdtdh w16sdtfl w16du wp14">
   <w:p>
     <w:pPr>
       <w:pStyle w:val="Footer"/>
@@ -436,10 +436,11 @@
 </file>
 
 <file path=word/footer2.xml><?xml version="1.0" encoding="utf-8"?>
-<w:ftr xmlns:wpc="http://schemas.microsoft.com/office/word/2010/wordprocessingCanvas" xmlns:cx="http://schemas.microsoft.com/office/drawing/2014/chartex" xmlns:cx1="http://schemas.microsoft.com/office/drawing/2015/9/8/chartex" xmlns:cx2="http://schemas.microsoft.com/office/drawing/2015/10/21/chartex" xmlns:cx3="http://schemas.microsoft.com/office/drawing/2016/5/9/chartex" xmlns:cx4="http://schemas.microsoft.com/office/drawing/2016/5/10/chartex" xmlns:cx5="http://schemas.microsoft.com/office/drawing/2016/5/11/chartex" xmlns:cx6="http://schemas.microsoft.com/office/drawing/2016/5/12/chartex" xmlns:cx7="http://schemas.microsoft.com/office/drawing/2016/5/13/chartex" xmlns:cx8="http://schemas.microsoft.com/office/drawing/2016/5/14/chartex" xmlns:mc="http://schemas.openxmlformats.org/markup-compatibility/2006" xmlns:aink="http://schemas.microsoft.com/office/drawing/2016/ink" xmlns:am3d="http://schemas.microsoft.com/office/drawing/2017/model3d" xmlns:o="urn:schemas-microsoft-com:office:office" xmlns:oel="http://schemas.microsoft.com/office/2019/extlst" xmlns:r="http://schemas.openxmlformats.org/officeDocument/2006/relationships" xmlns:m="http://schemas.openxmlformats.org/officeDocument/2006/math" xmlns:v="urn:schemas-microsoft-com:vml" xmlns:wp14="http://schemas.microsoft.com/office/word/2010/wordprocessingDrawing" xmlns:wp="http://schemas.openxmlformats.org/drawingml/2006/wordprocessingDrawing" xmlns:w10="urn:schemas-microsoft-com:office:word" xmlns:w="http://schemas.openxmlformats.org/wordprocessingml/2006/main" xmlns:w14="http://schemas.microsoft.com/office/word/2010/wordml" xmlns:w15="http://schemas.microsoft.com/office/word/2012/wordml" xmlns:w16cex="http://schemas.microsoft.com/office/word/2018/wordml/cex" xmlns:w16cid="http://schemas.microsoft.com/office/word/2016/wordml/cid" xmlns:w16="http://schemas.microsoft.com/office/word/2018/wordml" xmlns:w16du="http://schemas.microsoft.com/office/word/2023/wordml/word16du" xmlns:w16sdtdh="http://schemas.microsoft.com/office/word/2020/wordml/sdtdatahash" xmlns:w16se="http://schemas.microsoft.com/office/word/2015/wordml/symex" xmlns:wpg="http://schemas.microsoft.com/office/word/2010/wordprocessingGroup" xmlns:wpi="http://schemas.microsoft.com/office/word/2010/wordprocessingInk" xmlns:wne="http://schemas.microsoft.com/office/word/2006/wordml" xmlns:wps="http://schemas.microsoft.com/office/word/2010/wordprocessingShape" mc:Ignorable="w14 w15 w16se w16cid w16 w16cex w16sdtdh w16du wp14">
+<w:ftr xmlns:wpc="http://schemas.microsoft.com/office/word/2010/wordprocessingCanvas" xmlns:cx="http://schemas.microsoft.com/office/drawing/2014/chartex" xmlns:cx1="http://schemas.microsoft.com/office/drawing/2015/9/8/chartex" xmlns:cx2="http://schemas.microsoft.com/office/drawing/2015/10/21/chartex" xmlns:cx3="http://schemas.microsoft.com/office/drawing/2016/5/9/chartex" xmlns:cx4="http://schemas.microsoft.com/office/drawing/2016/5/10/chartex" xmlns:cx5="http://schemas.microsoft.com/office/drawing/2016/5/11/chartex" xmlns:cx6="http://schemas.microsoft.com/office/drawing/2016/5/12/chartex" xmlns:cx7="http://schemas.microsoft.com/office/drawing/2016/5/13/chartex" xmlns:cx8="http://schemas.microsoft.com/office/drawing/2016/5/14/chartex" xmlns:mc="http://schemas.openxmlformats.org/markup-compatibility/2006" xmlns:aink="http://schemas.microsoft.com/office/drawing/2016/ink" xmlns:am3d="http://schemas.microsoft.com/office/drawing/2017/model3d" xmlns:o="urn:schemas-microsoft-com:office:office" xmlns:oel="http://schemas.microsoft.com/office/2019/extlst" xmlns:r="http://schemas.openxmlformats.org/officeDocument/2006/relationships" xmlns:m="http://schemas.openxmlformats.org/officeDocument/2006/math" xmlns:v="urn:schemas-microsoft-com:vml" xmlns:wp14="http://schemas.microsoft.com/office/word/2010/wordprocessingDrawing" xmlns:wp="http://schemas.openxmlformats.org/drawingml/2006/wordprocessingDrawing" xmlns:w10="urn:schemas-microsoft-com:office:word" xmlns:w="http://schemas.openxmlformats.org/wordprocessingml/2006/main" xmlns:w14="http://schemas.microsoft.com/office/word/2010/wordml" xmlns:w15="http://schemas.microsoft.com/office/word/2012/wordml" xmlns:w16cex="http://schemas.microsoft.com/office/word/2018/wordml/cex" xmlns:w16cid="http://schemas.microsoft.com/office/word/2016/wordml/cid" xmlns:w16="http://schemas.microsoft.com/office/word/2018/wordml" xmlns:w16du="http://schemas.microsoft.com/office/word/2023/wordml/word16du" xmlns:w16sdtdh="http://schemas.microsoft.com/office/word/2020/wordml/sdtdatahash" xmlns:w16sdtfl="http://schemas.microsoft.com/office/word/2024/wordml/sdtformatlock" xmlns:w16se="http://schemas.microsoft.com/office/word/2015/wordml/symex" xmlns:wpg="http://schemas.microsoft.com/office/word/2010/wordprocessingGroup" xmlns:wpi="http://schemas.microsoft.com/office/word/2010/wordprocessingInk" xmlns:wne="http://schemas.microsoft.com/office/word/2006/wordml" xmlns:wps="http://schemas.microsoft.com/office/word/2010/wordprocessingShape" mc:Ignorable="w14 w15 w16se w16cid w16 w16cex w16sdtdh w16sdtfl w16du wp14">
   <w:p>
     <w:pPr>
       <w:pStyle w:val="Footer"/>
+      <w:jc w:val="center"/>
       <w:rPr>
         <w:sz w:val="20"/>
         <w:szCs w:val="20"/>
@@ -450,17 +451,17 @@
         <w:noProof/>
       </w:rPr>
       <w:drawing>
-        <wp:anchor distT="0" distB="0" distL="114300" distR="114300" simplePos="0" relativeHeight="251691520" behindDoc="0" locked="0" layoutInCell="1" allowOverlap="1" wp14:anchorId="1CB6DCA8" wp14:editId="69622E0A">
-          <wp:simplePos x="0" y="0"/>
-          <wp:positionH relativeFrom="column">
-            <wp:posOffset>4173855</wp:posOffset>
+        <wp:anchor distT="0" distB="0" distL="114300" distR="114300" simplePos="0" relativeHeight="251656704" behindDoc="0" locked="0" layoutInCell="1" allowOverlap="1" wp14:anchorId="1CB6DCA8" wp14:editId="697E0219">
+          <wp:simplePos x="3784600" y="8750300"/>
+          <wp:positionH relativeFrom="margin">
+            <wp:align>center</wp:align>
           </wp:positionH>
-          <wp:positionV relativeFrom="paragraph">
-            <wp:posOffset>-1191895</wp:posOffset>
+          <wp:positionV relativeFrom="margin">
+            <wp:align>bottom</wp:align>
           </wp:positionV>
           <wp:extent cx="507365" cy="762000"/>
           <wp:effectExtent l="0" t="0" r="0" b="0"/>
-          <wp:wrapNone/>
+          <wp:wrapSquare wrapText="bothSides"/>
           <wp:docPr id="219726832" name="Picture" descr="A logo for a health and leisure company&#10;&#10;Description automatically generated"/>
           <wp:cNvGraphicFramePr/>
           <a:graphic xmlns:a="http://schemas.openxmlformats.org/drawingml/2006/main">
@@ -507,69 +508,6 @@
     </w:r>
     <w:r>
       <w:rPr>
-        <w:noProof/>
-      </w:rPr>
-      <w:drawing>
-        <wp:anchor distT="0" distB="0" distL="114300" distR="114300" simplePos="0" relativeHeight="251657728" behindDoc="0" locked="0" layoutInCell="1" allowOverlap="1" wp14:anchorId="3294EA72" wp14:editId="71530BF8">
-          <wp:simplePos x="0" y="0"/>
-          <wp:positionH relativeFrom="column">
-            <wp:posOffset>1170612</wp:posOffset>
-          </wp:positionH>
-          <wp:positionV relativeFrom="paragraph">
-            <wp:posOffset>-1049020</wp:posOffset>
-          </wp:positionV>
-          <wp:extent cx="2768600" cy="476250"/>
-          <wp:effectExtent l="0" t="0" r="0" b="0"/>
-          <wp:wrapNone/>
-          <wp:docPr id="1401390926" name="Picture" descr="A logo with blue text&#10;&#10;Description automatically generated"/>
-          <wp:cNvGraphicFramePr/>
-          <a:graphic xmlns:a="http://schemas.openxmlformats.org/drawingml/2006/main">
-            <a:graphicData uri="http://schemas.openxmlformats.org/drawingml/2006/picture">
-              <pic:pic xmlns:pic="http://schemas.openxmlformats.org/drawingml/2006/picture">
-                <pic:nvPicPr>
-                  <pic:cNvPr id="1401390926" name="Picture" descr="A logo with blue text&#10;&#10;Description automatically generated"/>
-                  <pic:cNvPicPr>
-                    <a:picLocks noChangeAspect="1" noChangeArrowheads="1"/>
-                  </pic:cNvPicPr>
-                </pic:nvPicPr>
-                <pic:blipFill>
-                  <a:blip r:embed="rId2">
-                    <a:extLst>
-                      <a:ext uri="{28A0092B-C50C-407E-A947-70E740481C1C}">
-                        <a14:useLocalDpi xmlns:a14="http://schemas.microsoft.com/office/drawing/2010/main" val="0"/>
-                      </a:ext>
-                    </a:extLst>
-                  </a:blip>
-                  <a:stretch>
-                    <a:fillRect/>
-                  </a:stretch>
-                </pic:blipFill>
-                <pic:spPr bwMode="auto">
-                  <a:xfrm>
-                    <a:off x="0" y="0"/>
-                    <a:ext cx="2768600" cy="476250"/>
-                  </a:xfrm>
-                  <a:prstGeom prst="rect">
-                    <a:avLst/>
-                  </a:prstGeom>
-                  <a:noFill/>
-                  <a:ln w="9525">
-                    <a:noFill/>
-                    <a:headEnd/>
-                    <a:tailEnd/>
-                  </a:ln>
-                </pic:spPr>
-              </pic:pic>
-            </a:graphicData>
-          </a:graphic>
-        </wp:anchor>
-      </w:drawing>
-    </w:r>
-    <w:r>
-      <w:tab/>
-    </w:r>
-    <w:r>
-      <w:rPr>
         <w:b/>
         <w:bCs/>
         <w:sz w:val="20"/>
@@ -589,7 +527,7 @@
 </file>
 
 <file path=word/footnotes.xml><?xml version="1.0" encoding="utf-8"?>
-<w:footnotes xmlns:wpc="http://schemas.microsoft.com/office/word/2010/wordprocessingCanvas" xmlns:cx="http://schemas.microsoft.com/office/drawing/2014/chartex" xmlns:cx1="http://schemas.microsoft.com/office/drawing/2015/9/8/chartex" xmlns:cx2="http://schemas.microsoft.com/office/drawing/2015/10/21/chartex" xmlns:cx3="http://schemas.microsoft.com/office/drawing/2016/5/9/chartex" xmlns:cx4="http://schemas.microsoft.com/office/drawing/2016/5/10/chartex" xmlns:cx5="http://schemas.microsoft.com/office/drawing/2016/5/11/chartex" xmlns:cx6="http://schemas.microsoft.com/office/drawing/2016/5/12/chartex" xmlns:cx7="http://schemas.microsoft.com/office/drawing/2016/5/13/chartex" xmlns:cx8="http://schemas.microsoft.com/office/drawing/2016/5/14/chartex" xmlns:mc="http://schemas.openxmlformats.org/markup-compatibility/2006" xmlns:aink="http://schemas.microsoft.com/office/drawing/2016/ink" xmlns:am3d="http://schemas.microsoft.com/office/drawing/2017/model3d" xmlns:o="urn:schemas-microsoft-com:office:office" xmlns:oel="http://schemas.microsoft.com/office/2019/extlst" xmlns:r="http://schemas.openxmlformats.org/officeDocument/2006/relationships" xmlns:m="http://schemas.openxmlformats.org/officeDocument/2006/math" xmlns:v="urn:schemas-microsoft-com:vml" xmlns:wp14="http://schemas.microsoft.com/office/word/2010/wordprocessingDrawing" xmlns:wp="http://schemas.openxmlformats.org/drawingml/2006/wordprocessingDrawing" xmlns:w10="urn:schemas-microsoft-com:office:word" xmlns:w="http://schemas.openxmlformats.org/wordprocessingml/2006/main" xmlns:w14="http://schemas.microsoft.com/office/word/2010/wordml" xmlns:w15="http://schemas.microsoft.com/office/word/2012/wordml" xmlns:w16cex="http://schemas.microsoft.com/office/word/2018/wordml/cex" xmlns:w16cid="http://schemas.microsoft.com/office/word/2016/wordml/cid" xmlns:w16="http://schemas.microsoft.com/office/word/2018/wordml" xmlns:w16du="http://schemas.microsoft.com/office/word/2023/wordml/word16du" xmlns:w16sdtdh="http://schemas.microsoft.com/office/word/2020/wordml/sdtdatahash" xmlns:w16se="http://schemas.microsoft.com/office/word/2015/wordml/symex" xmlns:wpg="http://schemas.microsoft.com/office/word/2010/wordprocessingGroup" xmlns:wpi="http://schemas.microsoft.com/office/word/2010/wordprocessingInk" xmlns:wne="http://schemas.microsoft.com/office/word/2006/wordml" xmlns:wps="http://schemas.microsoft.com/office/word/2010/wordprocessingShape" mc:Ignorable="w14 w15 w16se w16cid w16 w16cex w16sdtdh w16du wp14">
+<w:footnotes xmlns:wpc="http://schemas.microsoft.com/office/word/2010/wordprocessingCanvas" xmlns:cx="http://schemas.microsoft.com/office/drawing/2014/chartex" xmlns:cx1="http://schemas.microsoft.com/office/drawing/2015/9/8/chartex" xmlns:cx2="http://schemas.microsoft.com/office/drawing/2015/10/21/chartex" xmlns:cx3="http://schemas.microsoft.com/office/drawing/2016/5/9/chartex" xmlns:cx4="http://schemas.microsoft.com/office/drawing/2016/5/10/chartex" xmlns:cx5="http://schemas.microsoft.com/office/drawing/2016/5/11/chartex" xmlns:cx6="http://schemas.microsoft.com/office/drawing/2016/5/12/chartex" xmlns:cx7="http://schemas.microsoft.com/office/drawing/2016/5/13/chartex" xmlns:cx8="http://schemas.microsoft.com/office/drawing/2016/5/14/chartex" xmlns:mc="http://schemas.openxmlformats.org/markup-compatibility/2006" xmlns:aink="http://schemas.microsoft.com/office/drawing/2016/ink" xmlns:am3d="http://schemas.microsoft.com/office/drawing/2017/model3d" xmlns:o="urn:schemas-microsoft-com:office:office" xmlns:oel="http://schemas.microsoft.com/office/2019/extlst" xmlns:r="http://schemas.openxmlformats.org/officeDocument/2006/relationships" xmlns:m="http://schemas.openxmlformats.org/officeDocument/2006/math" xmlns:v="urn:schemas-microsoft-com:vml" xmlns:wp14="http://schemas.microsoft.com/office/word/2010/wordprocessingDrawing" xmlns:wp="http://schemas.openxmlformats.org/drawingml/2006/wordprocessingDrawing" xmlns:w10="urn:schemas-microsoft-com:office:word" xmlns:w="http://schemas.openxmlformats.org/wordprocessingml/2006/main" xmlns:w14="http://schemas.microsoft.com/office/word/2010/wordml" xmlns:w15="http://schemas.microsoft.com/office/word/2012/wordml" xmlns:w16cex="http://schemas.microsoft.com/office/word/2018/wordml/cex" xmlns:w16cid="http://schemas.microsoft.com/office/word/2016/wordml/cid" xmlns:w16="http://schemas.microsoft.com/office/word/2018/wordml" xmlns:w16du="http://schemas.microsoft.com/office/word/2023/wordml/word16du" xmlns:w16sdtdh="http://schemas.microsoft.com/office/word/2020/wordml/sdtdatahash" xmlns:w16sdtfl="http://schemas.microsoft.com/office/word/2024/wordml/sdtformatlock" xmlns:w16se="http://schemas.microsoft.com/office/word/2015/wordml/symex" xmlns:wpg="http://schemas.microsoft.com/office/word/2010/wordprocessingGroup" xmlns:wpi="http://schemas.microsoft.com/office/word/2010/wordprocessingInk" xmlns:wne="http://schemas.microsoft.com/office/word/2006/wordml" xmlns:wps="http://schemas.microsoft.com/office/word/2010/wordprocessingShape" mc:Ignorable="w14 w15 w16se w16cid w16 w16cex w16sdtdh w16sdtfl w16du wp14">
   <w:footnote w:type="separator" w:id="-1">
     <w:p>
       <w:r>
@@ -615,17 +553,80 @@
 </file>
 
 <file path=word/header1.xml><?xml version="1.0" encoding="utf-8"?>
-<w:hdr xmlns:wpc="http://schemas.microsoft.com/office/word/2010/wordprocessingCanvas" xmlns:cx="http://schemas.microsoft.com/office/drawing/2014/chartex" xmlns:cx1="http://schemas.microsoft.com/office/drawing/2015/9/8/chartex" xmlns:cx2="http://schemas.microsoft.com/office/drawing/2015/10/21/chartex" xmlns:cx3="http://schemas.microsoft.com/office/drawing/2016/5/9/chartex" xmlns:cx4="http://schemas.microsoft.com/office/drawing/2016/5/10/chartex" xmlns:cx5="http://schemas.microsoft.com/office/drawing/2016/5/11/chartex" xmlns:cx6="http://schemas.microsoft.com/office/drawing/2016/5/12/chartex" xmlns:cx7="http://schemas.microsoft.com/office/drawing/2016/5/13/chartex" xmlns:cx8="http://schemas.microsoft.com/office/drawing/2016/5/14/chartex" xmlns:mc="http://schemas.openxmlformats.org/markup-compatibility/2006" xmlns:aink="http://schemas.microsoft.com/office/drawing/2016/ink" xmlns:am3d="http://schemas.microsoft.com/office/drawing/2017/model3d" xmlns:o="urn:schemas-microsoft-com:office:office" xmlns:oel="http://schemas.microsoft.com/office/2019/extlst" xmlns:r="http://schemas.openxmlformats.org/officeDocument/2006/relationships" xmlns:m="http://schemas.openxmlformats.org/officeDocument/2006/math" xmlns:v="urn:schemas-microsoft-com:vml" xmlns:wp14="http://schemas.microsoft.com/office/word/2010/wordprocessingDrawing" xmlns:wp="http://schemas.openxmlformats.org/drawingml/2006/wordprocessingDrawing" xmlns:w10="urn:schemas-microsoft-com:office:word" xmlns:w="http://schemas.openxmlformats.org/wordprocessingml/2006/main" xmlns:w14="http://schemas.microsoft.com/office/word/2010/wordml" xmlns:w15="http://schemas.microsoft.com/office/word/2012/wordml" xmlns:w16cex="http://schemas.microsoft.com/office/word/2018/wordml/cex" xmlns:w16cid="http://schemas.microsoft.com/office/word/2016/wordml/cid" xmlns:w16="http://schemas.microsoft.com/office/word/2018/wordml" xmlns:w16du="http://schemas.microsoft.com/office/word/2023/wordml/word16du" xmlns:w16sdtdh="http://schemas.microsoft.com/office/word/2020/wordml/sdtdatahash" xmlns:w16se="http://schemas.microsoft.com/office/word/2015/wordml/symex" xmlns:wpg="http://schemas.microsoft.com/office/word/2010/wordprocessingGroup" xmlns:wpi="http://schemas.microsoft.com/office/word/2010/wordprocessingInk" xmlns:wne="http://schemas.microsoft.com/office/word/2006/wordml" xmlns:wps="http://schemas.microsoft.com/office/word/2010/wordprocessingShape" mc:Ignorable="w14 w15 w16se w16cid w16 w16cex w16sdtdh w16du wp14">
+<w:hdr xmlns:wpc="http://schemas.microsoft.com/office/word/2010/wordprocessingCanvas" xmlns:cx="http://schemas.microsoft.com/office/drawing/2014/chartex" xmlns:cx1="http://schemas.microsoft.com/office/drawing/2015/9/8/chartex" xmlns:cx2="http://schemas.microsoft.com/office/drawing/2015/10/21/chartex" xmlns:cx3="http://schemas.microsoft.com/office/drawing/2016/5/9/chartex" xmlns:cx4="http://schemas.microsoft.com/office/drawing/2016/5/10/chartex" xmlns:cx5="http://schemas.microsoft.com/office/drawing/2016/5/11/chartex" xmlns:cx6="http://schemas.microsoft.com/office/drawing/2016/5/12/chartex" xmlns:cx7="http://schemas.microsoft.com/office/drawing/2016/5/13/chartex" xmlns:cx8="http://schemas.microsoft.com/office/drawing/2016/5/14/chartex" xmlns:mc="http://schemas.openxmlformats.org/markup-compatibility/2006" xmlns:aink="http://schemas.microsoft.com/office/drawing/2016/ink" xmlns:am3d="http://schemas.microsoft.com/office/drawing/2017/model3d" xmlns:o="urn:schemas-microsoft-com:office:office" xmlns:oel="http://schemas.microsoft.com/office/2019/extlst" xmlns:r="http://schemas.openxmlformats.org/officeDocument/2006/relationships" xmlns:m="http://schemas.openxmlformats.org/officeDocument/2006/math" xmlns:v="urn:schemas-microsoft-com:vml" xmlns:wp14="http://schemas.microsoft.com/office/word/2010/wordprocessingDrawing" xmlns:wp="http://schemas.openxmlformats.org/drawingml/2006/wordprocessingDrawing" xmlns:w10="urn:schemas-microsoft-com:office:word" xmlns:w="http://schemas.openxmlformats.org/wordprocessingml/2006/main" xmlns:w14="http://schemas.microsoft.com/office/word/2010/wordml" xmlns:w15="http://schemas.microsoft.com/office/word/2012/wordml" xmlns:w16cex="http://schemas.microsoft.com/office/word/2018/wordml/cex" xmlns:w16cid="http://schemas.microsoft.com/office/word/2016/wordml/cid" xmlns:w16="http://schemas.microsoft.com/office/word/2018/wordml" xmlns:w16du="http://schemas.microsoft.com/office/word/2023/wordml/word16du" xmlns:w16sdtdh="http://schemas.microsoft.com/office/word/2020/wordml/sdtdatahash" xmlns:w16sdtfl="http://schemas.microsoft.com/office/word/2024/wordml/sdtformatlock" xmlns:w16se="http://schemas.microsoft.com/office/word/2015/wordml/symex" xmlns:wpg="http://schemas.microsoft.com/office/word/2010/wordprocessingGroup" xmlns:wpi="http://schemas.microsoft.com/office/word/2010/wordprocessingInk" xmlns:wne="http://schemas.microsoft.com/office/word/2006/wordml" xmlns:wps="http://schemas.microsoft.com/office/word/2010/wordprocessingShape" mc:Ignorable="w14 w15 w16se w16cid w16 w16cex w16sdtdh w16sdtfl w16du wp14">
   <w:p>
     <w:pPr>
       <w:pStyle w:val="Header"/>
     </w:pPr>
+    <w:r>
+      <w:rPr>
+        <w:noProof/>
+        <w:sz w:val="20"/>
+        <w:szCs w:val="20"/>
+      </w:rPr>
+      <w:drawing>
+        <wp:anchor distT="0" distB="0" distL="114300" distR="114300" simplePos="0" relativeHeight="251658240" behindDoc="0" locked="0" layoutInCell="1" allowOverlap="1" wp14:anchorId="7CB95719" wp14:editId="0149378A">
+          <wp:simplePos x="0" y="0"/>
+          <wp:positionH relativeFrom="margin">
+            <wp:posOffset>5591175</wp:posOffset>
+          </wp:positionH>
+          <wp:positionV relativeFrom="margin">
+            <wp:posOffset>-1892300</wp:posOffset>
+          </wp:positionV>
+          <wp:extent cx="848995" cy="586105"/>
+          <wp:effectExtent l="0" t="0" r="0" b="0"/>
+          <wp:wrapSquare wrapText="bothSides"/>
+          <wp:docPr id="975955209" name="Picture 2" descr="A black and blue sign with text&#10;&#10;AI-generated content may be incorrect."/>
+          <wp:cNvGraphicFramePr>
+            <a:graphicFrameLocks xmlns:a="http://schemas.openxmlformats.org/drawingml/2006/main" noChangeAspect="1"/>
+          </wp:cNvGraphicFramePr>
+          <a:graphic xmlns:a="http://schemas.openxmlformats.org/drawingml/2006/main">
+            <a:graphicData uri="http://schemas.openxmlformats.org/drawingml/2006/picture">
+              <pic:pic xmlns:pic="http://schemas.openxmlformats.org/drawingml/2006/picture">
+                <pic:nvPicPr>
+                  <pic:cNvPr id="975955209" name="Picture 2" descr="A black and blue sign with text&#10;&#10;AI-generated content may be incorrect."/>
+                  <pic:cNvPicPr>
+                    <a:picLocks noChangeAspect="1" noChangeArrowheads="1"/>
+                  </pic:cNvPicPr>
+                </pic:nvPicPr>
+                <pic:blipFill>
+                  <a:blip r:embed="rId1">
+                    <a:extLst>
+                      <a:ext uri="{28A0092B-C50C-407E-A947-70E740481C1C}">
+                        <a14:useLocalDpi xmlns:a14="http://schemas.microsoft.com/office/drawing/2010/main" val="0"/>
+                      </a:ext>
+                    </a:extLst>
+                  </a:blip>
+                  <a:srcRect/>
+                  <a:stretch>
+                    <a:fillRect/>
+                  </a:stretch>
+                </pic:blipFill>
+                <pic:spPr bwMode="auto">
+                  <a:xfrm>
+                    <a:off x="0" y="0"/>
+                    <a:ext cx="848995" cy="586105"/>
+                  </a:xfrm>
+                  <a:prstGeom prst="rect">
+                    <a:avLst/>
+                  </a:prstGeom>
+                  <a:noFill/>
+                  <a:ln>
+                    <a:noFill/>
+                  </a:ln>
+                </pic:spPr>
+              </pic:pic>
+            </a:graphicData>
+          </a:graphic>
+        </wp:anchor>
+      </w:drawing>
+    </w:r>
     <w:r>
       <w:rPr>
         <w:noProof/>
       </w:rPr>
       <w:drawing>
-        <wp:anchor distT="0" distB="0" distL="114300" distR="114300" simplePos="0" relativeHeight="251658245" behindDoc="0" locked="0" layoutInCell="1" allowOverlap="1" wp14:anchorId="591B2C01" wp14:editId="4C9E50B3">
+        <wp:anchor distT="0" distB="0" distL="114300" distR="114300" simplePos="0" relativeHeight="251658245" behindDoc="0" locked="0" layoutInCell="1" allowOverlap="1" wp14:anchorId="591B2C01" wp14:editId="2B821F65">
           <wp:simplePos x="0" y="0"/>
           <wp:positionH relativeFrom="margin">
             <wp:posOffset>45220</wp:posOffset>
@@ -648,7 +649,7 @@
                   </pic:cNvPicPr>
                 </pic:nvPicPr>
                 <pic:blipFill>
-                  <a:blip r:embed="rId1">
+                  <a:blip r:embed="rId2">
                     <a:extLst>
                       <a:ext uri="{28A0092B-C50C-407E-A947-70E740481C1C}">
                         <a14:useLocalDpi xmlns:a14="http://schemas.microsoft.com/office/drawing/2010/main" val="0"/>
@@ -714,7 +715,7 @@
                   <pic:cNvPicPr/>
                 </pic:nvPicPr>
                 <pic:blipFill>
-                  <a:blip r:embed="rId2">
+                  <a:blip r:embed="rId3">
                     <a:extLst>
                       <a:ext uri="{28A0092B-C50C-407E-A947-70E740481C1C}">
                         <a14:useLocalDpi xmlns:a14="http://schemas.microsoft.com/office/drawing/2010/main" val="0"/>
@@ -745,7 +746,7 @@
 </file>
 
 <file path=word/numbering.xml><?xml version="1.0" encoding="utf-8"?>
-<w:numbering xmlns:wpc="http://schemas.microsoft.com/office/word/2010/wordprocessingCanvas" xmlns:cx="http://schemas.microsoft.com/office/drawing/2014/chartex" xmlns:cx1="http://schemas.microsoft.com/office/drawing/2015/9/8/chartex" xmlns:cx2="http://schemas.microsoft.com/office/drawing/2015/10/21/chartex" xmlns:cx3="http://schemas.microsoft.com/office/drawing/2016/5/9/chartex" xmlns:cx4="http://schemas.microsoft.com/office/drawing/2016/5/10/chartex" xmlns:cx5="http://schemas.microsoft.com/office/drawing/2016/5/11/chartex" xmlns:cx6="http://schemas.microsoft.com/office/drawing/2016/5/12/chartex" xmlns:cx7="http://schemas.microsoft.com/office/drawing/2016/5/13/chartex" xmlns:cx8="http://schemas.microsoft.com/office/drawing/2016/5/14/chartex" xmlns:mc="http://schemas.openxmlformats.org/markup-compatibility/2006" xmlns:aink="http://schemas.microsoft.com/office/drawing/2016/ink" xmlns:am3d="http://schemas.microsoft.com/office/drawing/2017/model3d" xmlns:o="urn:schemas-microsoft-com:office:office" xmlns:oel="http://schemas.microsoft.com/office/2019/extlst" xmlns:r="http://schemas.openxmlformats.org/officeDocument/2006/relationships" xmlns:m="http://schemas.openxmlformats.org/officeDocument/2006/math" xmlns:v="urn:schemas-microsoft-com:vml" xmlns:wp14="http://schemas.microsoft.com/office/word/2010/wordprocessingDrawing" xmlns:wp="http://schemas.openxmlformats.org/drawingml/2006/wordprocessingDrawing" xmlns:w10="urn:schemas-microsoft-com:office:word" xmlns:w="http://schemas.openxmlformats.org/wordprocessingml/2006/main" xmlns:w14="http://schemas.microsoft.com/office/word/2010/wordml" xmlns:w15="http://schemas.microsoft.com/office/word/2012/wordml" xmlns:w16cex="http://schemas.microsoft.com/office/word/2018/wordml/cex" xmlns:w16cid="http://schemas.microsoft.com/office/word/2016/wordml/cid" xmlns:w16="http://schemas.microsoft.com/office/word/2018/wordml" xmlns:w16du="http://schemas.microsoft.com/office/word/2023/wordml/word16du" xmlns:w16sdtdh="http://schemas.microsoft.com/office/word/2020/wordml/sdtdatahash" xmlns:w16se="http://schemas.microsoft.com/office/word/2015/wordml/symex" xmlns:wpg="http://schemas.microsoft.com/office/word/2010/wordprocessingGroup" xmlns:wpi="http://schemas.microsoft.com/office/word/2010/wordprocessingInk" xmlns:wne="http://schemas.microsoft.com/office/word/2006/wordml" xmlns:wps="http://schemas.microsoft.com/office/word/2010/wordprocessingShape" mc:Ignorable="w14 w15 w16se w16cid w16 w16cex w16sdtdh w16du wp14">
+<w:numbering xmlns:wpc="http://schemas.microsoft.com/office/word/2010/wordprocessingCanvas" xmlns:cx="http://schemas.microsoft.com/office/drawing/2014/chartex" xmlns:cx1="http://schemas.microsoft.com/office/drawing/2015/9/8/chartex" xmlns:cx2="http://schemas.microsoft.com/office/drawing/2015/10/21/chartex" xmlns:cx3="http://schemas.microsoft.com/office/drawing/2016/5/9/chartex" xmlns:cx4="http://schemas.microsoft.com/office/drawing/2016/5/10/chartex" xmlns:cx5="http://schemas.microsoft.com/office/drawing/2016/5/11/chartex" xmlns:cx6="http://schemas.microsoft.com/office/drawing/2016/5/12/chartex" xmlns:cx7="http://schemas.microsoft.com/office/drawing/2016/5/13/chartex" xmlns:cx8="http://schemas.microsoft.com/office/drawing/2016/5/14/chartex" xmlns:mc="http://schemas.openxmlformats.org/markup-compatibility/2006" xmlns:aink="http://schemas.microsoft.com/office/drawing/2016/ink" xmlns:am3d="http://schemas.microsoft.com/office/drawing/2017/model3d" xmlns:o="urn:schemas-microsoft-com:office:office" xmlns:oel="http://schemas.microsoft.com/office/2019/extlst" xmlns:r="http://schemas.openxmlformats.org/officeDocument/2006/relationships" xmlns:m="http://schemas.openxmlformats.org/officeDocument/2006/math" xmlns:v="urn:schemas-microsoft-com:vml" xmlns:wp14="http://schemas.microsoft.com/office/word/2010/wordprocessingDrawing" xmlns:wp="http://schemas.openxmlformats.org/drawingml/2006/wordprocessingDrawing" xmlns:w10="urn:schemas-microsoft-com:office:word" xmlns:w="http://schemas.openxmlformats.org/wordprocessingml/2006/main" xmlns:w14="http://schemas.microsoft.com/office/word/2010/wordml" xmlns:w15="http://schemas.microsoft.com/office/word/2012/wordml" xmlns:w16cex="http://schemas.microsoft.com/office/word/2018/wordml/cex" xmlns:w16cid="http://schemas.microsoft.com/office/word/2016/wordml/cid" xmlns:w16="http://schemas.microsoft.com/office/word/2018/wordml" xmlns:w16du="http://schemas.microsoft.com/office/word/2023/wordml/word16du" xmlns:w16sdtdh="http://schemas.microsoft.com/office/word/2020/wordml/sdtdatahash" xmlns:w16sdtfl="http://schemas.microsoft.com/office/word/2024/wordml/sdtformatlock" xmlns:w16se="http://schemas.microsoft.com/office/word/2015/wordml/symex" xmlns:wpg="http://schemas.microsoft.com/office/word/2010/wordprocessingGroup" xmlns:wpi="http://schemas.microsoft.com/office/word/2010/wordprocessingInk" xmlns:wne="http://schemas.microsoft.com/office/word/2006/wordml" xmlns:wps="http://schemas.microsoft.com/office/word/2010/wordprocessingShape" mc:Ignorable="w14 w15 w16se w16cid w16 w16cex w16sdtdh w16sdtfl w16du wp14">
   <w:abstractNum w:abstractNumId="0" w15:restartNumberingAfterBreak="0">
     <w:nsid w:val="0000A990"/>
     <w:multiLevelType w:val="multilevel"/>
@@ -1242,7 +1243,7 @@
 </file>
 
 <file path=word/styles.xml><?xml version="1.0" encoding="utf-8"?>
-<w:styles xmlns:mc="http://schemas.openxmlformats.org/markup-compatibility/2006" xmlns:r="http://schemas.openxmlformats.org/officeDocument/2006/relationships" xmlns:w="http://schemas.openxmlformats.org/wordprocessingml/2006/main" xmlns:w14="http://schemas.microsoft.com/office/word/2010/wordml" xmlns:w15="http://schemas.microsoft.com/office/word/2012/wordml" xmlns:w16cex="http://schemas.microsoft.com/office/word/2018/wordml/cex" xmlns:w16cid="http://schemas.microsoft.com/office/word/2016/wordml/cid" xmlns:w16="http://schemas.microsoft.com/office/word/2018/wordml" xmlns:w16du="http://schemas.microsoft.com/office/word/2023/wordml/word16du" xmlns:w16sdtdh="http://schemas.microsoft.com/office/word/2020/wordml/sdtdatahash" xmlns:w16se="http://schemas.microsoft.com/office/word/2015/wordml/symex" mc:Ignorable="w14 w15 w16se w16cid w16 w16cex w16sdtdh w16du">
+<w:styles xmlns:mc="http://schemas.openxmlformats.org/markup-compatibility/2006" xmlns:r="http://schemas.openxmlformats.org/officeDocument/2006/relationships" xmlns:w="http://schemas.openxmlformats.org/wordprocessingml/2006/main" xmlns:w14="http://schemas.microsoft.com/office/word/2010/wordml" xmlns:w15="http://schemas.microsoft.com/office/word/2012/wordml" xmlns:w16cex="http://schemas.microsoft.com/office/word/2018/wordml/cex" xmlns:w16cid="http://schemas.microsoft.com/office/word/2016/wordml/cid" xmlns:w16="http://schemas.microsoft.com/office/word/2018/wordml" xmlns:w16du="http://schemas.microsoft.com/office/word/2023/wordml/word16du" xmlns:w16sdtdh="http://schemas.microsoft.com/office/word/2020/wordml/sdtdatahash" xmlns:w16sdtfl="http://schemas.microsoft.com/office/word/2024/wordml/sdtformatlock" xmlns:w16se="http://schemas.microsoft.com/office/word/2015/wordml/symex" mc:Ignorable="w14 w15 w16se w16cid w16 w16cex w16sdtdh w16sdtfl w16du">
   <w:docDefaults>
     <w:rPrDefault>
       <w:rPr>

</xml_diff>